<commit_message>
12.1 tạo thu muc frontend
</commit_message>
<xml_diff>
--- a/baocao.docx
+++ b/baocao.docx
@@ -1,6 +1,6 @@
 
 <file path=word/document.xml><?xml version="1.0" encoding="utf-8"?>
-<w:document xmlns:wpc="http://schemas.microsoft.com/office/word/2010/wordprocessingCanvas" xmlns:mc="http://schemas.openxmlformats.org/markup-compatibility/2006" xmlns:o="urn:schemas-microsoft-com:office:office" xmlns:r="http://schemas.openxmlformats.org/officeDocument/2006/relationships" xmlns:m="http://schemas.openxmlformats.org/officeDocument/2006/math" xmlns:v="urn:schemas-microsoft-com:vml" xmlns:wp14="http://schemas.microsoft.com/office/word/2010/wordprocessingDrawing" xmlns:wp="http://schemas.openxmlformats.org/drawingml/2006/wordprocessingDrawing" xmlns:w10="urn:schemas-microsoft-com:office:word" xmlns:w="http://schemas.openxmlformats.org/wordprocessingml/2006/main" xmlns:w14="http://schemas.microsoft.com/office/word/2010/wordml" xmlns:w15="http://schemas.microsoft.com/office/word/2012/wordml" xmlns:wpg="http://schemas.microsoft.com/office/word/2010/wordprocessingGroup" xmlns:wpi="http://schemas.microsoft.com/office/word/2010/wordprocessingInk" xmlns:wne="http://schemas.microsoft.com/office/word/2006/wordml" xmlns:wps="http://schemas.microsoft.com/office/word/2010/wordprocessingShape" mc:Ignorable="w14 w15 wp14">
+<w:document xmlns:wpc="http://schemas.microsoft.com/office/word/2010/wordprocessingCanvas" xmlns:cx="http://schemas.microsoft.com/office/drawing/2014/chartex" xmlns:cx1="http://schemas.microsoft.com/office/drawing/2015/9/8/chartex" xmlns:cx2="http://schemas.microsoft.com/office/drawing/2015/10/21/chartex" xmlns:cx3="http://schemas.microsoft.com/office/drawing/2016/5/9/chartex" xmlns:cx4="http://schemas.microsoft.com/office/drawing/2016/5/10/chartex" xmlns:cx5="http://schemas.microsoft.com/office/drawing/2016/5/11/chartex" xmlns:cx6="http://schemas.microsoft.com/office/drawing/2016/5/12/chartex" xmlns:cx7="http://schemas.microsoft.com/office/drawing/2016/5/13/chartex" xmlns:cx8="http://schemas.microsoft.com/office/drawing/2016/5/14/chartex" xmlns:mc="http://schemas.openxmlformats.org/markup-compatibility/2006" xmlns:aink="http://schemas.microsoft.com/office/drawing/2016/ink" xmlns:am3d="http://schemas.microsoft.com/office/drawing/2017/model3d" xmlns:o="urn:schemas-microsoft-com:office:office" xmlns:oel="http://schemas.microsoft.com/office/2019/extlst" xmlns:r="http://schemas.openxmlformats.org/officeDocument/2006/relationships" xmlns:m="http://schemas.openxmlformats.org/officeDocument/2006/math" xmlns:v="urn:schemas-microsoft-com:vml" xmlns:wp14="http://schemas.microsoft.com/office/word/2010/wordprocessingDrawing" xmlns:wp="http://schemas.openxmlformats.org/drawingml/2006/wordprocessingDrawing" xmlns:w10="urn:schemas-microsoft-com:office:word" xmlns:w="http://schemas.openxmlformats.org/wordprocessingml/2006/main" xmlns:w14="http://schemas.microsoft.com/office/word/2010/wordml" xmlns:w15="http://schemas.microsoft.com/office/word/2012/wordml" xmlns:w16cex="http://schemas.microsoft.com/office/word/2018/wordml/cex" xmlns:w16cid="http://schemas.microsoft.com/office/word/2016/wordml/cid" xmlns:w16="http://schemas.microsoft.com/office/word/2018/wordml" xmlns:w16du="http://schemas.microsoft.com/office/word/2023/wordml/word16du" xmlns:w16sdtdh="http://schemas.microsoft.com/office/word/2020/wordml/sdtdatahash" xmlns:w16sdtfl="http://schemas.microsoft.com/office/word/2024/wordml/sdtformatlock" xmlns:w16se="http://schemas.microsoft.com/office/word/2015/wordml/symex" xmlns:wpg="http://schemas.microsoft.com/office/word/2010/wordprocessingGroup" xmlns:wpi="http://schemas.microsoft.com/office/word/2010/wordprocessingInk" xmlns:wne="http://schemas.microsoft.com/office/word/2006/wordml" xmlns:wps="http://schemas.microsoft.com/office/word/2010/wordprocessingShape" mc:Ignorable="w14 w15 w16se w16cid w16 w16cex w16sdtdh w16sdtfl w16du wp14">
   <w:body>
     <w:p>
       <w:pPr>
@@ -1084,7 +1084,6 @@
           <w:lang w:val="vi-VN"/>
         </w:rPr>
       </w:pPr>
-      <w:bookmarkStart w:id="0" w:name="_GoBack"/>
       <w:r>
         <w:rPr>
           <w:lang w:val="vi-VN"/>
@@ -1098,7 +1097,6 @@
         <w:t>và phạm vi nghiên cứu</w:t>
       </w:r>
     </w:p>
-    <w:bookmarkEnd w:id="0"/>
     <w:p>
       <w:pPr>
         <w:rPr>
@@ -1440,11 +1438,11 @@
         <w:tblLook w:val="04A0" w:firstRow="1" w:lastRow="0" w:firstColumn="1" w:lastColumn="0" w:noHBand="0" w:noVBand="1"/>
       </w:tblPr>
       <w:tblGrid>
-        <w:gridCol w:w="1755"/>
-        <w:gridCol w:w="1755"/>
-        <w:gridCol w:w="1756"/>
-        <w:gridCol w:w="1756"/>
-        <w:gridCol w:w="1756"/>
+        <w:gridCol w:w="985"/>
+        <w:gridCol w:w="2700"/>
+        <w:gridCol w:w="1620"/>
+        <w:gridCol w:w="1530"/>
+        <w:gridCol w:w="1874"/>
       </w:tblGrid>
       <w:tr>
         <w:trPr>
@@ -1453,7 +1451,7 @@
         <w:tc>
           <w:tcPr>
             <w:cnfStyle w:val="001000000000" w:firstRow="0" w:lastRow="0" w:firstColumn="1" w:lastColumn="0" w:oddVBand="0" w:evenVBand="0" w:oddHBand="0" w:evenHBand="0" w:firstRowFirstColumn="0" w:firstRowLastColumn="0" w:lastRowFirstColumn="0" w:lastRowLastColumn="0"/>
-            <w:tcW w:w="1755" w:type="dxa"/>
+            <w:tcW w:w="985" w:type="dxa"/>
           </w:tcPr>
           <w:p>
             <w:r>
@@ -1463,10 +1461,11 @@
         </w:tc>
         <w:tc>
           <w:tcPr>
-            <w:tcW w:w="1755" w:type="dxa"/>
-          </w:tcPr>
-          <w:p>
-            <w:pPr>
+            <w:tcW w:w="2700" w:type="dxa"/>
+          </w:tcPr>
+          <w:p>
+            <w:pPr>
+              <w:jc w:val="left"/>
               <w:cnfStyle w:val="100000000000" w:firstRow="1" w:lastRow="0" w:firstColumn="0" w:lastColumn="0" w:oddVBand="0" w:evenVBand="0" w:oddHBand="0" w:evenHBand="0" w:firstRowFirstColumn="0" w:firstRowLastColumn="0" w:lastRowFirstColumn="0" w:lastRowLastColumn="0"/>
             </w:pPr>
             <w:r>
@@ -1476,7 +1475,7 @@
         </w:tc>
         <w:tc>
           <w:tcPr>
-            <w:tcW w:w="1756" w:type="dxa"/>
+            <w:tcW w:w="1620" w:type="dxa"/>
           </w:tcPr>
           <w:p>
             <w:pPr>
@@ -1489,7 +1488,7 @@
         </w:tc>
         <w:tc>
           <w:tcPr>
-            <w:tcW w:w="1756" w:type="dxa"/>
+            <w:tcW w:w="1530" w:type="dxa"/>
           </w:tcPr>
           <w:p>
             <w:pPr>
@@ -1502,7 +1501,7 @@
         </w:tc>
         <w:tc>
           <w:tcPr>
-            <w:tcW w:w="1756" w:type="dxa"/>
+            <w:tcW w:w="1874" w:type="dxa"/>
           </w:tcPr>
           <w:p>
             <w:pPr>
@@ -1518,43 +1517,1149 @@
         <w:tc>
           <w:tcPr>
             <w:cnfStyle w:val="001000000000" w:firstRow="0" w:lastRow="0" w:firstColumn="1" w:lastColumn="0" w:oddVBand="0" w:evenVBand="0" w:oddHBand="0" w:evenHBand="0" w:firstRowFirstColumn="0" w:firstRowLastColumn="0" w:lastRowFirstColumn="0" w:lastRowLastColumn="0"/>
-            <w:tcW w:w="1755" w:type="dxa"/>
-          </w:tcPr>
-          <w:p/>
-        </w:tc>
-        <w:tc>
-          <w:tcPr>
-            <w:tcW w:w="1755" w:type="dxa"/>
-          </w:tcPr>
-          <w:p>
-            <w:pPr>
-              <w:cnfStyle w:val="000000000000" w:firstRow="0" w:lastRow="0" w:firstColumn="0" w:lastColumn="0" w:oddVBand="0" w:evenVBand="0" w:oddHBand="0" w:evenHBand="0" w:firstRowFirstColumn="0" w:firstRowLastColumn="0" w:lastRowFirstColumn="0" w:lastRowLastColumn="0"/>
-            </w:pPr>
-          </w:p>
-        </w:tc>
-        <w:tc>
-          <w:tcPr>
-            <w:tcW w:w="1756" w:type="dxa"/>
-          </w:tcPr>
-          <w:p>
-            <w:pPr>
-              <w:cnfStyle w:val="000000000000" w:firstRow="0" w:lastRow="0" w:firstColumn="0" w:lastColumn="0" w:oddVBand="0" w:evenVBand="0" w:oddHBand="0" w:evenHBand="0" w:firstRowFirstColumn="0" w:firstRowLastColumn="0" w:lastRowFirstColumn="0" w:lastRowLastColumn="0"/>
-            </w:pPr>
-          </w:p>
-        </w:tc>
-        <w:tc>
-          <w:tcPr>
-            <w:tcW w:w="1756" w:type="dxa"/>
-          </w:tcPr>
-          <w:p>
-            <w:pPr>
-              <w:cnfStyle w:val="000000000000" w:firstRow="0" w:lastRow="0" w:firstColumn="0" w:lastColumn="0" w:oddVBand="0" w:evenVBand="0" w:oddHBand="0" w:evenHBand="0" w:firstRowFirstColumn="0" w:firstRowLastColumn="0" w:lastRowFirstColumn="0" w:lastRowLastColumn="0"/>
-            </w:pPr>
-          </w:p>
-        </w:tc>
-        <w:tc>
-          <w:tcPr>
-            <w:tcW w:w="1756" w:type="dxa"/>
+            <w:tcW w:w="985" w:type="dxa"/>
+          </w:tcPr>
+          <w:p>
+            <w:pPr>
+              <w:pStyle w:val="ListParagraph"/>
+              <w:numPr>
+                <w:ilvl w:val="0"/>
+                <w:numId w:val="4"/>
+              </w:numPr>
+              <w:rPr>
+                <w:b w:val="0"/>
+                <w:bCs/>
+              </w:rPr>
+            </w:pPr>
+          </w:p>
+        </w:tc>
+        <w:tc>
+          <w:tcPr>
+            <w:tcW w:w="2700" w:type="dxa"/>
+          </w:tcPr>
+          <w:p>
+            <w:pPr>
+              <w:cnfStyle w:val="000000000000" w:firstRow="0" w:lastRow="0" w:firstColumn="0" w:lastColumn="0" w:oddVBand="0" w:evenVBand="0" w:oddHBand="0" w:evenHBand="0" w:firstRowFirstColumn="0" w:firstRowLastColumn="0" w:lastRowFirstColumn="0" w:lastRowLastColumn="0"/>
+            </w:pPr>
+            <w:r>
+              <w:t>Đăng nhập / Đăng xuất</w:t>
+            </w:r>
+          </w:p>
+        </w:tc>
+        <w:tc>
+          <w:tcPr>
+            <w:tcW w:w="1620" w:type="dxa"/>
+          </w:tcPr>
+          <w:p>
+            <w:pPr>
+              <w:cnfStyle w:val="000000000000" w:firstRow="0" w:lastRow="0" w:firstColumn="0" w:lastColumn="0" w:oddVBand="0" w:evenVBand="0" w:oddHBand="0" w:evenHBand="0" w:firstRowFirstColumn="0" w:firstRowLastColumn="0" w:lastRowFirstColumn="0" w:lastRowLastColumn="0"/>
+              <w:rPr>
+                <w:lang w:val="vi-VN"/>
+              </w:rPr>
+            </w:pPr>
+          </w:p>
+        </w:tc>
+        <w:tc>
+          <w:tcPr>
+            <w:tcW w:w="1530" w:type="dxa"/>
+          </w:tcPr>
+          <w:p>
+            <w:pPr>
+              <w:cnfStyle w:val="000000000000" w:firstRow="0" w:lastRow="0" w:firstColumn="0" w:lastColumn="0" w:oddVBand="0" w:evenVBand="0" w:oddHBand="0" w:evenHBand="0" w:firstRowFirstColumn="0" w:firstRowLastColumn="0" w:lastRowFirstColumn="0" w:lastRowLastColumn="0"/>
+            </w:pPr>
+          </w:p>
+        </w:tc>
+        <w:tc>
+          <w:tcPr>
+            <w:tcW w:w="1874" w:type="dxa"/>
+          </w:tcPr>
+          <w:p>
+            <w:pPr>
+              <w:cnfStyle w:val="000000000000" w:firstRow="0" w:lastRow="0" w:firstColumn="0" w:lastColumn="0" w:oddVBand="0" w:evenVBand="0" w:oddHBand="0" w:evenHBand="0" w:firstRowFirstColumn="0" w:firstRowLastColumn="0" w:lastRowFirstColumn="0" w:lastRowLastColumn="0"/>
+            </w:pPr>
+          </w:p>
+        </w:tc>
+      </w:tr>
+      <w:tr>
+        <w:tc>
+          <w:tcPr>
+            <w:cnfStyle w:val="001000000000" w:firstRow="0" w:lastRow="0" w:firstColumn="1" w:lastColumn="0" w:oddVBand="0" w:evenVBand="0" w:oddHBand="0" w:evenHBand="0" w:firstRowFirstColumn="0" w:firstRowLastColumn="0" w:lastRowFirstColumn="0" w:lastRowLastColumn="0"/>
+            <w:tcW w:w="985" w:type="dxa"/>
+          </w:tcPr>
+          <w:p>
+            <w:pPr>
+              <w:pStyle w:val="ListParagraph"/>
+              <w:numPr>
+                <w:ilvl w:val="0"/>
+                <w:numId w:val="4"/>
+              </w:numPr>
+              <w:rPr>
+                <w:b w:val="0"/>
+                <w:bCs/>
+              </w:rPr>
+            </w:pPr>
+          </w:p>
+        </w:tc>
+        <w:tc>
+          <w:tcPr>
+            <w:tcW w:w="2700" w:type="dxa"/>
+          </w:tcPr>
+          <w:p>
+            <w:pPr>
+              <w:cnfStyle w:val="000000000000" w:firstRow="0" w:lastRow="0" w:firstColumn="0" w:lastColumn="0" w:oddVBand="0" w:evenVBand="0" w:oddHBand="0" w:evenHBand="0" w:firstRowFirstColumn="0" w:firstRowLastColumn="0" w:lastRowFirstColumn="0" w:lastRowLastColumn="0"/>
+            </w:pPr>
+            <w:r>
+              <w:t>Quản lý danh mục sản phẩm</w:t>
+            </w:r>
+          </w:p>
+        </w:tc>
+        <w:tc>
+          <w:tcPr>
+            <w:tcW w:w="1620" w:type="dxa"/>
+          </w:tcPr>
+          <w:p>
+            <w:pPr>
+              <w:cnfStyle w:val="000000000000" w:firstRow="0" w:lastRow="0" w:firstColumn="0" w:lastColumn="0" w:oddVBand="0" w:evenVBand="0" w:oddHBand="0" w:evenHBand="0" w:firstRowFirstColumn="0" w:firstRowLastColumn="0" w:lastRowFirstColumn="0" w:lastRowLastColumn="0"/>
+            </w:pPr>
+          </w:p>
+        </w:tc>
+        <w:tc>
+          <w:tcPr>
+            <w:tcW w:w="1530" w:type="dxa"/>
+          </w:tcPr>
+          <w:p>
+            <w:pPr>
+              <w:cnfStyle w:val="000000000000" w:firstRow="0" w:lastRow="0" w:firstColumn="0" w:lastColumn="0" w:oddVBand="0" w:evenVBand="0" w:oddHBand="0" w:evenHBand="0" w:firstRowFirstColumn="0" w:firstRowLastColumn="0" w:lastRowFirstColumn="0" w:lastRowLastColumn="0"/>
+            </w:pPr>
+          </w:p>
+        </w:tc>
+        <w:tc>
+          <w:tcPr>
+            <w:tcW w:w="1874" w:type="dxa"/>
+          </w:tcPr>
+          <w:p>
+            <w:pPr>
+              <w:cnfStyle w:val="000000000000" w:firstRow="0" w:lastRow="0" w:firstColumn="0" w:lastColumn="0" w:oddVBand="0" w:evenVBand="0" w:oddHBand="0" w:evenHBand="0" w:firstRowFirstColumn="0" w:firstRowLastColumn="0" w:lastRowFirstColumn="0" w:lastRowLastColumn="0"/>
+            </w:pPr>
+          </w:p>
+        </w:tc>
+      </w:tr>
+      <w:tr>
+        <w:tc>
+          <w:tcPr>
+            <w:cnfStyle w:val="001000000000" w:firstRow="0" w:lastRow="0" w:firstColumn="1" w:lastColumn="0" w:oddVBand="0" w:evenVBand="0" w:oddHBand="0" w:evenHBand="0" w:firstRowFirstColumn="0" w:firstRowLastColumn="0" w:lastRowFirstColumn="0" w:lastRowLastColumn="0"/>
+            <w:tcW w:w="985" w:type="dxa"/>
+          </w:tcPr>
+          <w:p>
+            <w:pPr>
+              <w:pStyle w:val="ListParagraph"/>
+              <w:numPr>
+                <w:ilvl w:val="0"/>
+                <w:numId w:val="4"/>
+              </w:numPr>
+              <w:rPr>
+                <w:b w:val="0"/>
+                <w:bCs/>
+              </w:rPr>
+            </w:pPr>
+          </w:p>
+        </w:tc>
+        <w:tc>
+          <w:tcPr>
+            <w:tcW w:w="2700" w:type="dxa"/>
+          </w:tcPr>
+          <w:tbl>
+            <w:tblPr>
+              <w:tblW w:w="0" w:type="auto"/>
+              <w:tblCellSpacing w:w="15" w:type="dxa"/>
+              <w:tblCellMar>
+                <w:top w:w="15" w:type="dxa"/>
+                <w:left w:w="15" w:type="dxa"/>
+                <w:bottom w:w="15" w:type="dxa"/>
+                <w:right w:w="15" w:type="dxa"/>
+              </w:tblCellMar>
+              <w:tblLook w:val="04A0" w:firstRow="1" w:lastRow="0" w:firstColumn="1" w:lastColumn="0" w:noHBand="0" w:noVBand="1"/>
+            </w:tblPr>
+            <w:tblGrid>
+              <w:gridCol w:w="96"/>
+            </w:tblGrid>
+            <w:tr>
+              <w:trPr>
+                <w:tblCellSpacing w:w="15" w:type="dxa"/>
+              </w:trPr>
+              <w:tc>
+                <w:tcPr>
+                  <w:tcW w:w="0" w:type="auto"/>
+                  <w:vAlign w:val="center"/>
+                  <w:hideMark/>
+                </w:tcPr>
+                <w:p>
+                  <w:pPr>
+                    <w:spacing w:after="120" w:line="240" w:lineRule="auto"/>
+                    <w:rPr>
+                      <w:sz w:val="26"/>
+                    </w:rPr>
+                  </w:pPr>
+                </w:p>
+              </w:tc>
+            </w:tr>
+          </w:tbl>
+          <w:p>
+            <w:pPr>
+              <w:cnfStyle w:val="000000000000" w:firstRow="0" w:lastRow="0" w:firstColumn="0" w:lastColumn="0" w:oddVBand="0" w:evenVBand="0" w:oddHBand="0" w:evenHBand="0" w:firstRowFirstColumn="0" w:firstRowLastColumn="0" w:lastRowFirstColumn="0" w:lastRowLastColumn="0"/>
+              <w:rPr>
+                <w:vanish/>
+              </w:rPr>
+            </w:pPr>
+          </w:p>
+          <w:p>
+            <w:pPr>
+              <w:cnfStyle w:val="000000000000" w:firstRow="0" w:lastRow="0" w:firstColumn="0" w:lastColumn="0" w:oddVBand="0" w:evenVBand="0" w:oddHBand="0" w:evenHBand="0" w:firstRowFirstColumn="0" w:firstRowLastColumn="0" w:lastRowFirstColumn="0" w:lastRowLastColumn="0"/>
+              <w:rPr>
+                <w:lang w:val="vi-VN"/>
+              </w:rPr>
+            </w:pPr>
+            <w:r>
+              <w:t>Quản lý sản phẩm</w:t>
+            </w:r>
+          </w:p>
+        </w:tc>
+        <w:tc>
+          <w:tcPr>
+            <w:tcW w:w="1620" w:type="dxa"/>
+          </w:tcPr>
+          <w:p>
+            <w:pPr>
+              <w:cnfStyle w:val="000000000000" w:firstRow="0" w:lastRow="0" w:firstColumn="0" w:lastColumn="0" w:oddVBand="0" w:evenVBand="0" w:oddHBand="0" w:evenHBand="0" w:firstRowFirstColumn="0" w:firstRowLastColumn="0" w:lastRowFirstColumn="0" w:lastRowLastColumn="0"/>
+            </w:pPr>
+          </w:p>
+        </w:tc>
+        <w:tc>
+          <w:tcPr>
+            <w:tcW w:w="1530" w:type="dxa"/>
+          </w:tcPr>
+          <w:p>
+            <w:pPr>
+              <w:cnfStyle w:val="000000000000" w:firstRow="0" w:lastRow="0" w:firstColumn="0" w:lastColumn="0" w:oddVBand="0" w:evenVBand="0" w:oddHBand="0" w:evenHBand="0" w:firstRowFirstColumn="0" w:firstRowLastColumn="0" w:lastRowFirstColumn="0" w:lastRowLastColumn="0"/>
+            </w:pPr>
+          </w:p>
+        </w:tc>
+        <w:tc>
+          <w:tcPr>
+            <w:tcW w:w="1874" w:type="dxa"/>
+          </w:tcPr>
+          <w:p>
+            <w:pPr>
+              <w:cnfStyle w:val="000000000000" w:firstRow="0" w:lastRow="0" w:firstColumn="0" w:lastColumn="0" w:oddVBand="0" w:evenVBand="0" w:oddHBand="0" w:evenHBand="0" w:firstRowFirstColumn="0" w:firstRowLastColumn="0" w:lastRowFirstColumn="0" w:lastRowLastColumn="0"/>
+            </w:pPr>
+          </w:p>
+        </w:tc>
+      </w:tr>
+      <w:tr>
+        <w:tc>
+          <w:tcPr>
+            <w:cnfStyle w:val="001000000000" w:firstRow="0" w:lastRow="0" w:firstColumn="1" w:lastColumn="0" w:oddVBand="0" w:evenVBand="0" w:oddHBand="0" w:evenHBand="0" w:firstRowFirstColumn="0" w:firstRowLastColumn="0" w:lastRowFirstColumn="0" w:lastRowLastColumn="0"/>
+            <w:tcW w:w="985" w:type="dxa"/>
+          </w:tcPr>
+          <w:p>
+            <w:pPr>
+              <w:pStyle w:val="ListParagraph"/>
+              <w:numPr>
+                <w:ilvl w:val="0"/>
+                <w:numId w:val="4"/>
+              </w:numPr>
+              <w:rPr>
+                <w:b w:val="0"/>
+                <w:bCs/>
+              </w:rPr>
+            </w:pPr>
+          </w:p>
+        </w:tc>
+        <w:tc>
+          <w:tcPr>
+            <w:tcW w:w="2700" w:type="dxa"/>
+          </w:tcPr>
+          <w:p>
+            <w:pPr>
+              <w:cnfStyle w:val="000000000000" w:firstRow="0" w:lastRow="0" w:firstColumn="0" w:lastColumn="0" w:oddVBand="0" w:evenVBand="0" w:oddHBand="0" w:evenHBand="0" w:firstRowFirstColumn="0" w:firstRowLastColumn="0" w:lastRowFirstColumn="0" w:lastRowLastColumn="0"/>
+            </w:pPr>
+            <w:r>
+              <w:t>Quản lý hình ảnh sản phẩm</w:t>
+            </w:r>
+          </w:p>
+        </w:tc>
+        <w:tc>
+          <w:tcPr>
+            <w:tcW w:w="1620" w:type="dxa"/>
+          </w:tcPr>
+          <w:p>
+            <w:pPr>
+              <w:cnfStyle w:val="000000000000" w:firstRow="0" w:lastRow="0" w:firstColumn="0" w:lastColumn="0" w:oddVBand="0" w:evenVBand="0" w:oddHBand="0" w:evenHBand="0" w:firstRowFirstColumn="0" w:firstRowLastColumn="0" w:lastRowFirstColumn="0" w:lastRowLastColumn="0"/>
+            </w:pPr>
+          </w:p>
+        </w:tc>
+        <w:tc>
+          <w:tcPr>
+            <w:tcW w:w="1530" w:type="dxa"/>
+          </w:tcPr>
+          <w:p>
+            <w:pPr>
+              <w:cnfStyle w:val="000000000000" w:firstRow="0" w:lastRow="0" w:firstColumn="0" w:lastColumn="0" w:oddVBand="0" w:evenVBand="0" w:oddHBand="0" w:evenHBand="0" w:firstRowFirstColumn="0" w:firstRowLastColumn="0" w:lastRowFirstColumn="0" w:lastRowLastColumn="0"/>
+            </w:pPr>
+          </w:p>
+        </w:tc>
+        <w:tc>
+          <w:tcPr>
+            <w:tcW w:w="1874" w:type="dxa"/>
+          </w:tcPr>
+          <w:p>
+            <w:pPr>
+              <w:cnfStyle w:val="000000000000" w:firstRow="0" w:lastRow="0" w:firstColumn="0" w:lastColumn="0" w:oddVBand="0" w:evenVBand="0" w:oddHBand="0" w:evenHBand="0" w:firstRowFirstColumn="0" w:firstRowLastColumn="0" w:lastRowFirstColumn="0" w:lastRowLastColumn="0"/>
+            </w:pPr>
+          </w:p>
+        </w:tc>
+      </w:tr>
+      <w:tr>
+        <w:tc>
+          <w:tcPr>
+            <w:cnfStyle w:val="001000000000" w:firstRow="0" w:lastRow="0" w:firstColumn="1" w:lastColumn="0" w:oddVBand="0" w:evenVBand="0" w:oddHBand="0" w:evenHBand="0" w:firstRowFirstColumn="0" w:firstRowLastColumn="0" w:lastRowFirstColumn="0" w:lastRowLastColumn="0"/>
+            <w:tcW w:w="985" w:type="dxa"/>
+          </w:tcPr>
+          <w:p>
+            <w:pPr>
+              <w:pStyle w:val="ListParagraph"/>
+              <w:numPr>
+                <w:ilvl w:val="0"/>
+                <w:numId w:val="4"/>
+              </w:numPr>
+              <w:rPr>
+                <w:b w:val="0"/>
+                <w:bCs/>
+              </w:rPr>
+            </w:pPr>
+          </w:p>
+        </w:tc>
+        <w:tc>
+          <w:tcPr>
+            <w:tcW w:w="2700" w:type="dxa"/>
+          </w:tcPr>
+          <w:p>
+            <w:pPr>
+              <w:cnfStyle w:val="000000000000" w:firstRow="0" w:lastRow="0" w:firstColumn="0" w:lastColumn="0" w:oddVBand="0" w:evenVBand="0" w:oddHBand="0" w:evenHBand="0" w:firstRowFirstColumn="0" w:firstRowLastColumn="0" w:lastRowFirstColumn="0" w:lastRowLastColumn="0"/>
+            </w:pPr>
+            <w:r>
+              <w:t>Quản lý nhà cung cấp</w:t>
+            </w:r>
+          </w:p>
+        </w:tc>
+        <w:tc>
+          <w:tcPr>
+            <w:tcW w:w="1620" w:type="dxa"/>
+          </w:tcPr>
+          <w:p>
+            <w:pPr>
+              <w:cnfStyle w:val="000000000000" w:firstRow="0" w:lastRow="0" w:firstColumn="0" w:lastColumn="0" w:oddVBand="0" w:evenVBand="0" w:oddHBand="0" w:evenHBand="0" w:firstRowFirstColumn="0" w:firstRowLastColumn="0" w:lastRowFirstColumn="0" w:lastRowLastColumn="0"/>
+            </w:pPr>
+          </w:p>
+        </w:tc>
+        <w:tc>
+          <w:tcPr>
+            <w:tcW w:w="1530" w:type="dxa"/>
+          </w:tcPr>
+          <w:p>
+            <w:pPr>
+              <w:cnfStyle w:val="000000000000" w:firstRow="0" w:lastRow="0" w:firstColumn="0" w:lastColumn="0" w:oddVBand="0" w:evenVBand="0" w:oddHBand="0" w:evenHBand="0" w:firstRowFirstColumn="0" w:firstRowLastColumn="0" w:lastRowFirstColumn="0" w:lastRowLastColumn="0"/>
+            </w:pPr>
+          </w:p>
+        </w:tc>
+        <w:tc>
+          <w:tcPr>
+            <w:tcW w:w="1874" w:type="dxa"/>
+          </w:tcPr>
+          <w:p>
+            <w:pPr>
+              <w:cnfStyle w:val="000000000000" w:firstRow="0" w:lastRow="0" w:firstColumn="0" w:lastColumn="0" w:oddVBand="0" w:evenVBand="0" w:oddHBand="0" w:evenHBand="0" w:firstRowFirstColumn="0" w:firstRowLastColumn="0" w:lastRowFirstColumn="0" w:lastRowLastColumn="0"/>
+            </w:pPr>
+          </w:p>
+        </w:tc>
+      </w:tr>
+      <w:tr>
+        <w:tc>
+          <w:tcPr>
+            <w:cnfStyle w:val="001000000000" w:firstRow="0" w:lastRow="0" w:firstColumn="1" w:lastColumn="0" w:oddVBand="0" w:evenVBand="0" w:oddHBand="0" w:evenHBand="0" w:firstRowFirstColumn="0" w:firstRowLastColumn="0" w:lastRowFirstColumn="0" w:lastRowLastColumn="0"/>
+            <w:tcW w:w="985" w:type="dxa"/>
+          </w:tcPr>
+          <w:p>
+            <w:pPr>
+              <w:pStyle w:val="ListParagraph"/>
+              <w:numPr>
+                <w:ilvl w:val="0"/>
+                <w:numId w:val="4"/>
+              </w:numPr>
+              <w:rPr>
+                <w:b w:val="0"/>
+                <w:bCs/>
+              </w:rPr>
+            </w:pPr>
+          </w:p>
+        </w:tc>
+        <w:tc>
+          <w:tcPr>
+            <w:tcW w:w="2700" w:type="dxa"/>
+          </w:tcPr>
+          <w:p>
+            <w:pPr>
+              <w:cnfStyle w:val="000000000000" w:firstRow="0" w:lastRow="0" w:firstColumn="0" w:lastColumn="0" w:oddVBand="0" w:evenVBand="0" w:oddHBand="0" w:evenHBand="0" w:firstRowFirstColumn="0" w:firstRowLastColumn="0" w:lastRowFirstColumn="0" w:lastRowLastColumn="0"/>
+            </w:pPr>
+            <w:r>
+              <w:t>Quản lý khách hàng</w:t>
+            </w:r>
+          </w:p>
+        </w:tc>
+        <w:tc>
+          <w:tcPr>
+            <w:tcW w:w="1620" w:type="dxa"/>
+          </w:tcPr>
+          <w:p>
+            <w:pPr>
+              <w:cnfStyle w:val="000000000000" w:firstRow="0" w:lastRow="0" w:firstColumn="0" w:lastColumn="0" w:oddVBand="0" w:evenVBand="0" w:oddHBand="0" w:evenHBand="0" w:firstRowFirstColumn="0" w:firstRowLastColumn="0" w:lastRowFirstColumn="0" w:lastRowLastColumn="0"/>
+            </w:pPr>
+          </w:p>
+        </w:tc>
+        <w:tc>
+          <w:tcPr>
+            <w:tcW w:w="1530" w:type="dxa"/>
+          </w:tcPr>
+          <w:p>
+            <w:pPr>
+              <w:cnfStyle w:val="000000000000" w:firstRow="0" w:lastRow="0" w:firstColumn="0" w:lastColumn="0" w:oddVBand="0" w:evenVBand="0" w:oddHBand="0" w:evenHBand="0" w:firstRowFirstColumn="0" w:firstRowLastColumn="0" w:lastRowFirstColumn="0" w:lastRowLastColumn="0"/>
+            </w:pPr>
+          </w:p>
+        </w:tc>
+        <w:tc>
+          <w:tcPr>
+            <w:tcW w:w="1874" w:type="dxa"/>
+          </w:tcPr>
+          <w:p>
+            <w:pPr>
+              <w:cnfStyle w:val="000000000000" w:firstRow="0" w:lastRow="0" w:firstColumn="0" w:lastColumn="0" w:oddVBand="0" w:evenVBand="0" w:oddHBand="0" w:evenHBand="0" w:firstRowFirstColumn="0" w:firstRowLastColumn="0" w:lastRowFirstColumn="0" w:lastRowLastColumn="0"/>
+            </w:pPr>
+          </w:p>
+        </w:tc>
+      </w:tr>
+      <w:tr>
+        <w:tc>
+          <w:tcPr>
+            <w:cnfStyle w:val="001000000000" w:firstRow="0" w:lastRow="0" w:firstColumn="1" w:lastColumn="0" w:oddVBand="0" w:evenVBand="0" w:oddHBand="0" w:evenHBand="0" w:firstRowFirstColumn="0" w:firstRowLastColumn="0" w:lastRowFirstColumn="0" w:lastRowLastColumn="0"/>
+            <w:tcW w:w="985" w:type="dxa"/>
+          </w:tcPr>
+          <w:p>
+            <w:pPr>
+              <w:pStyle w:val="ListParagraph"/>
+              <w:numPr>
+                <w:ilvl w:val="0"/>
+                <w:numId w:val="4"/>
+              </w:numPr>
+              <w:rPr>
+                <w:b w:val="0"/>
+                <w:bCs/>
+              </w:rPr>
+            </w:pPr>
+          </w:p>
+        </w:tc>
+        <w:tc>
+          <w:tcPr>
+            <w:tcW w:w="2700" w:type="dxa"/>
+          </w:tcPr>
+          <w:p>
+            <w:pPr>
+              <w:cnfStyle w:val="000000000000" w:firstRow="0" w:lastRow="0" w:firstColumn="0" w:lastColumn="0" w:oddVBand="0" w:evenVBand="0" w:oddHBand="0" w:evenHBand="0" w:firstRowFirstColumn="0" w:firstRowLastColumn="0" w:lastRowFirstColumn="0" w:lastRowLastColumn="0"/>
+            </w:pPr>
+            <w:r>
+              <w:t>Quản lý nhân viên</w:t>
+            </w:r>
+          </w:p>
+        </w:tc>
+        <w:tc>
+          <w:tcPr>
+            <w:tcW w:w="1620" w:type="dxa"/>
+          </w:tcPr>
+          <w:p>
+            <w:pPr>
+              <w:cnfStyle w:val="000000000000" w:firstRow="0" w:lastRow="0" w:firstColumn="0" w:lastColumn="0" w:oddVBand="0" w:evenVBand="0" w:oddHBand="0" w:evenHBand="0" w:firstRowFirstColumn="0" w:firstRowLastColumn="0" w:lastRowFirstColumn="0" w:lastRowLastColumn="0"/>
+            </w:pPr>
+          </w:p>
+        </w:tc>
+        <w:tc>
+          <w:tcPr>
+            <w:tcW w:w="1530" w:type="dxa"/>
+          </w:tcPr>
+          <w:p>
+            <w:pPr>
+              <w:cnfStyle w:val="000000000000" w:firstRow="0" w:lastRow="0" w:firstColumn="0" w:lastColumn="0" w:oddVBand="0" w:evenVBand="0" w:oddHBand="0" w:evenHBand="0" w:firstRowFirstColumn="0" w:firstRowLastColumn="0" w:lastRowFirstColumn="0" w:lastRowLastColumn="0"/>
+            </w:pPr>
+          </w:p>
+        </w:tc>
+        <w:tc>
+          <w:tcPr>
+            <w:tcW w:w="1874" w:type="dxa"/>
+          </w:tcPr>
+          <w:p>
+            <w:pPr>
+              <w:cnfStyle w:val="000000000000" w:firstRow="0" w:lastRow="0" w:firstColumn="0" w:lastColumn="0" w:oddVBand="0" w:evenVBand="0" w:oddHBand="0" w:evenHBand="0" w:firstRowFirstColumn="0" w:firstRowLastColumn="0" w:lastRowFirstColumn="0" w:lastRowLastColumn="0"/>
+            </w:pPr>
+          </w:p>
+        </w:tc>
+      </w:tr>
+      <w:tr>
+        <w:tc>
+          <w:tcPr>
+            <w:cnfStyle w:val="001000000000" w:firstRow="0" w:lastRow="0" w:firstColumn="1" w:lastColumn="0" w:oddVBand="0" w:evenVBand="0" w:oddHBand="0" w:evenHBand="0" w:firstRowFirstColumn="0" w:firstRowLastColumn="0" w:lastRowFirstColumn="0" w:lastRowLastColumn="0"/>
+            <w:tcW w:w="985" w:type="dxa"/>
+          </w:tcPr>
+          <w:p>
+            <w:pPr>
+              <w:pStyle w:val="ListParagraph"/>
+              <w:numPr>
+                <w:ilvl w:val="0"/>
+                <w:numId w:val="4"/>
+              </w:numPr>
+              <w:rPr>
+                <w:b w:val="0"/>
+                <w:bCs/>
+              </w:rPr>
+            </w:pPr>
+          </w:p>
+        </w:tc>
+        <w:tc>
+          <w:tcPr>
+            <w:tcW w:w="2700" w:type="dxa"/>
+          </w:tcPr>
+          <w:p>
+            <w:pPr>
+              <w:cnfStyle w:val="000000000000" w:firstRow="0" w:lastRow="0" w:firstColumn="0" w:lastColumn="0" w:oddVBand="0" w:evenVBand="0" w:oddHBand="0" w:evenHBand="0" w:firstRowFirstColumn="0" w:firstRowLastColumn="0" w:lastRowFirstColumn="0" w:lastRowLastColumn="0"/>
+            </w:pPr>
+            <w:r>
+              <w:t>Quản lý đơn vị vận chuyển</w:t>
+            </w:r>
+          </w:p>
+        </w:tc>
+        <w:tc>
+          <w:tcPr>
+            <w:tcW w:w="1620" w:type="dxa"/>
+          </w:tcPr>
+          <w:p>
+            <w:pPr>
+              <w:cnfStyle w:val="000000000000" w:firstRow="0" w:lastRow="0" w:firstColumn="0" w:lastColumn="0" w:oddVBand="0" w:evenVBand="0" w:oddHBand="0" w:evenHBand="0" w:firstRowFirstColumn="0" w:firstRowLastColumn="0" w:lastRowFirstColumn="0" w:lastRowLastColumn="0"/>
+            </w:pPr>
+          </w:p>
+        </w:tc>
+        <w:tc>
+          <w:tcPr>
+            <w:tcW w:w="1530" w:type="dxa"/>
+          </w:tcPr>
+          <w:p>
+            <w:pPr>
+              <w:cnfStyle w:val="000000000000" w:firstRow="0" w:lastRow="0" w:firstColumn="0" w:lastColumn="0" w:oddVBand="0" w:evenVBand="0" w:oddHBand="0" w:evenHBand="0" w:firstRowFirstColumn="0" w:firstRowLastColumn="0" w:lastRowFirstColumn="0" w:lastRowLastColumn="0"/>
+            </w:pPr>
+          </w:p>
+        </w:tc>
+        <w:tc>
+          <w:tcPr>
+            <w:tcW w:w="1874" w:type="dxa"/>
+          </w:tcPr>
+          <w:p>
+            <w:pPr>
+              <w:cnfStyle w:val="000000000000" w:firstRow="0" w:lastRow="0" w:firstColumn="0" w:lastColumn="0" w:oddVBand="0" w:evenVBand="0" w:oddHBand="0" w:evenHBand="0" w:firstRowFirstColumn="0" w:firstRowLastColumn="0" w:lastRowFirstColumn="0" w:lastRowLastColumn="0"/>
+            </w:pPr>
+          </w:p>
+        </w:tc>
+      </w:tr>
+      <w:tr>
+        <w:tc>
+          <w:tcPr>
+            <w:cnfStyle w:val="001000000000" w:firstRow="0" w:lastRow="0" w:firstColumn="1" w:lastColumn="0" w:oddVBand="0" w:evenVBand="0" w:oddHBand="0" w:evenHBand="0" w:firstRowFirstColumn="0" w:firstRowLastColumn="0" w:lastRowFirstColumn="0" w:lastRowLastColumn="0"/>
+            <w:tcW w:w="985" w:type="dxa"/>
+          </w:tcPr>
+          <w:p>
+            <w:pPr>
+              <w:pStyle w:val="ListParagraph"/>
+              <w:numPr>
+                <w:ilvl w:val="0"/>
+                <w:numId w:val="4"/>
+              </w:numPr>
+              <w:rPr>
+                <w:b w:val="0"/>
+                <w:bCs/>
+              </w:rPr>
+            </w:pPr>
+          </w:p>
+        </w:tc>
+        <w:tc>
+          <w:tcPr>
+            <w:tcW w:w="2700" w:type="dxa"/>
+          </w:tcPr>
+          <w:p>
+            <w:pPr>
+              <w:cnfStyle w:val="000000000000" w:firstRow="0" w:lastRow="0" w:firstColumn="0" w:lastColumn="0" w:oddVBand="0" w:evenVBand="0" w:oddHBand="0" w:evenHBand="0" w:firstRowFirstColumn="0" w:firstRowLastColumn="0" w:lastRowFirstColumn="0" w:lastRowLastColumn="0"/>
+            </w:pPr>
+            <w:r>
+              <w:t>Quản lý đơn hàng</w:t>
+            </w:r>
+          </w:p>
+        </w:tc>
+        <w:tc>
+          <w:tcPr>
+            <w:tcW w:w="1620" w:type="dxa"/>
+          </w:tcPr>
+          <w:p>
+            <w:pPr>
+              <w:cnfStyle w:val="000000000000" w:firstRow="0" w:lastRow="0" w:firstColumn="0" w:lastColumn="0" w:oddVBand="0" w:evenVBand="0" w:oddHBand="0" w:evenHBand="0" w:firstRowFirstColumn="0" w:firstRowLastColumn="0" w:lastRowFirstColumn="0" w:lastRowLastColumn="0"/>
+            </w:pPr>
+          </w:p>
+        </w:tc>
+        <w:tc>
+          <w:tcPr>
+            <w:tcW w:w="1530" w:type="dxa"/>
+          </w:tcPr>
+          <w:p>
+            <w:pPr>
+              <w:cnfStyle w:val="000000000000" w:firstRow="0" w:lastRow="0" w:firstColumn="0" w:lastColumn="0" w:oddVBand="0" w:evenVBand="0" w:oddHBand="0" w:evenHBand="0" w:firstRowFirstColumn="0" w:firstRowLastColumn="0" w:lastRowFirstColumn="0" w:lastRowLastColumn="0"/>
+            </w:pPr>
+          </w:p>
+        </w:tc>
+        <w:tc>
+          <w:tcPr>
+            <w:tcW w:w="1874" w:type="dxa"/>
+          </w:tcPr>
+          <w:p>
+            <w:pPr>
+              <w:cnfStyle w:val="000000000000" w:firstRow="0" w:lastRow="0" w:firstColumn="0" w:lastColumn="0" w:oddVBand="0" w:evenVBand="0" w:oddHBand="0" w:evenHBand="0" w:firstRowFirstColumn="0" w:firstRowLastColumn="0" w:lastRowFirstColumn="0" w:lastRowLastColumn="0"/>
+            </w:pPr>
+          </w:p>
+        </w:tc>
+      </w:tr>
+      <w:tr>
+        <w:tc>
+          <w:tcPr>
+            <w:cnfStyle w:val="001000000000" w:firstRow="0" w:lastRow="0" w:firstColumn="1" w:lastColumn="0" w:oddVBand="0" w:evenVBand="0" w:oddHBand="0" w:evenHBand="0" w:firstRowFirstColumn="0" w:firstRowLastColumn="0" w:lastRowFirstColumn="0" w:lastRowLastColumn="0"/>
+            <w:tcW w:w="985" w:type="dxa"/>
+          </w:tcPr>
+          <w:p>
+            <w:pPr>
+              <w:pStyle w:val="ListParagraph"/>
+              <w:numPr>
+                <w:ilvl w:val="0"/>
+                <w:numId w:val="4"/>
+              </w:numPr>
+              <w:rPr>
+                <w:b w:val="0"/>
+                <w:bCs/>
+              </w:rPr>
+            </w:pPr>
+          </w:p>
+        </w:tc>
+        <w:tc>
+          <w:tcPr>
+            <w:tcW w:w="2700" w:type="dxa"/>
+          </w:tcPr>
+          <w:p>
+            <w:pPr>
+              <w:cnfStyle w:val="000000000000" w:firstRow="0" w:lastRow="0" w:firstColumn="0" w:lastColumn="0" w:oddVBand="0" w:evenVBand="0" w:oddHBand="0" w:evenHBand="0" w:firstRowFirstColumn="0" w:firstRowLastColumn="0" w:lastRowFirstColumn="0" w:lastRowLastColumn="0"/>
+            </w:pPr>
+            <w:r>
+              <w:t>Quản lý chi tiết đơn hàng</w:t>
+            </w:r>
+          </w:p>
+        </w:tc>
+        <w:tc>
+          <w:tcPr>
+            <w:tcW w:w="1620" w:type="dxa"/>
+          </w:tcPr>
+          <w:p>
+            <w:pPr>
+              <w:cnfStyle w:val="000000000000" w:firstRow="0" w:lastRow="0" w:firstColumn="0" w:lastColumn="0" w:oddVBand="0" w:evenVBand="0" w:oddHBand="0" w:evenHBand="0" w:firstRowFirstColumn="0" w:firstRowLastColumn="0" w:lastRowFirstColumn="0" w:lastRowLastColumn="0"/>
+            </w:pPr>
+          </w:p>
+        </w:tc>
+        <w:tc>
+          <w:tcPr>
+            <w:tcW w:w="1530" w:type="dxa"/>
+          </w:tcPr>
+          <w:p>
+            <w:pPr>
+              <w:cnfStyle w:val="000000000000" w:firstRow="0" w:lastRow="0" w:firstColumn="0" w:lastColumn="0" w:oddVBand="0" w:evenVBand="0" w:oddHBand="0" w:evenHBand="0" w:firstRowFirstColumn="0" w:firstRowLastColumn="0" w:lastRowFirstColumn="0" w:lastRowLastColumn="0"/>
+            </w:pPr>
+          </w:p>
+        </w:tc>
+        <w:tc>
+          <w:tcPr>
+            <w:tcW w:w="1874" w:type="dxa"/>
+          </w:tcPr>
+          <w:p>
+            <w:pPr>
+              <w:cnfStyle w:val="000000000000" w:firstRow="0" w:lastRow="0" w:firstColumn="0" w:lastColumn="0" w:oddVBand="0" w:evenVBand="0" w:oddHBand="0" w:evenHBand="0" w:firstRowFirstColumn="0" w:firstRowLastColumn="0" w:lastRowFirstColumn="0" w:lastRowLastColumn="0"/>
+            </w:pPr>
+          </w:p>
+        </w:tc>
+      </w:tr>
+      <w:tr>
+        <w:tc>
+          <w:tcPr>
+            <w:cnfStyle w:val="001000000000" w:firstRow="0" w:lastRow="0" w:firstColumn="1" w:lastColumn="0" w:oddVBand="0" w:evenVBand="0" w:oddHBand="0" w:evenHBand="0" w:firstRowFirstColumn="0" w:firstRowLastColumn="0" w:lastRowFirstColumn="0" w:lastRowLastColumn="0"/>
+            <w:tcW w:w="985" w:type="dxa"/>
+          </w:tcPr>
+          <w:p>
+            <w:pPr>
+              <w:pStyle w:val="ListParagraph"/>
+              <w:numPr>
+                <w:ilvl w:val="0"/>
+                <w:numId w:val="4"/>
+              </w:numPr>
+              <w:rPr>
+                <w:b w:val="0"/>
+                <w:bCs/>
+              </w:rPr>
+            </w:pPr>
+          </w:p>
+        </w:tc>
+        <w:tc>
+          <w:tcPr>
+            <w:tcW w:w="2700" w:type="dxa"/>
+          </w:tcPr>
+          <w:p>
+            <w:pPr>
+              <w:cnfStyle w:val="000000000000" w:firstRow="0" w:lastRow="0" w:firstColumn="0" w:lastColumn="0" w:oddVBand="0" w:evenVBand="0" w:oddHBand="0" w:evenHBand="0" w:firstRowFirstColumn="0" w:firstRowLastColumn="0" w:lastRowFirstColumn="0" w:lastRowLastColumn="0"/>
+            </w:pPr>
+            <w:r>
+              <w:t>Tìm kiếm sản phẩm</w:t>
+            </w:r>
+          </w:p>
+        </w:tc>
+        <w:tc>
+          <w:tcPr>
+            <w:tcW w:w="1620" w:type="dxa"/>
+          </w:tcPr>
+          <w:p>
+            <w:pPr>
+              <w:cnfStyle w:val="000000000000" w:firstRow="0" w:lastRow="0" w:firstColumn="0" w:lastColumn="0" w:oddVBand="0" w:evenVBand="0" w:oddHBand="0" w:evenHBand="0" w:firstRowFirstColumn="0" w:firstRowLastColumn="0" w:lastRowFirstColumn="0" w:lastRowLastColumn="0"/>
+            </w:pPr>
+          </w:p>
+        </w:tc>
+        <w:tc>
+          <w:tcPr>
+            <w:tcW w:w="1530" w:type="dxa"/>
+          </w:tcPr>
+          <w:p>
+            <w:pPr>
+              <w:cnfStyle w:val="000000000000" w:firstRow="0" w:lastRow="0" w:firstColumn="0" w:lastColumn="0" w:oddVBand="0" w:evenVBand="0" w:oddHBand="0" w:evenHBand="0" w:firstRowFirstColumn="0" w:firstRowLastColumn="0" w:lastRowFirstColumn="0" w:lastRowLastColumn="0"/>
+            </w:pPr>
+          </w:p>
+        </w:tc>
+        <w:tc>
+          <w:tcPr>
+            <w:tcW w:w="1874" w:type="dxa"/>
+          </w:tcPr>
+          <w:p>
+            <w:pPr>
+              <w:cnfStyle w:val="000000000000" w:firstRow="0" w:lastRow="0" w:firstColumn="0" w:lastColumn="0" w:oddVBand="0" w:evenVBand="0" w:oddHBand="0" w:evenHBand="0" w:firstRowFirstColumn="0" w:firstRowLastColumn="0" w:lastRowFirstColumn="0" w:lastRowLastColumn="0"/>
+            </w:pPr>
+          </w:p>
+        </w:tc>
+      </w:tr>
+      <w:tr>
+        <w:tc>
+          <w:tcPr>
+            <w:cnfStyle w:val="001000000000" w:firstRow="0" w:lastRow="0" w:firstColumn="1" w:lastColumn="0" w:oddVBand="0" w:evenVBand="0" w:oddHBand="0" w:evenHBand="0" w:firstRowFirstColumn="0" w:firstRowLastColumn="0" w:lastRowFirstColumn="0" w:lastRowLastColumn="0"/>
+            <w:tcW w:w="985" w:type="dxa"/>
+          </w:tcPr>
+          <w:p>
+            <w:pPr>
+              <w:pStyle w:val="ListParagraph"/>
+              <w:numPr>
+                <w:ilvl w:val="0"/>
+                <w:numId w:val="4"/>
+              </w:numPr>
+              <w:rPr>
+                <w:b w:val="0"/>
+                <w:bCs/>
+              </w:rPr>
+            </w:pPr>
+          </w:p>
+        </w:tc>
+        <w:tc>
+          <w:tcPr>
+            <w:tcW w:w="2700" w:type="dxa"/>
+          </w:tcPr>
+          <w:p>
+            <w:pPr>
+              <w:cnfStyle w:val="000000000000" w:firstRow="0" w:lastRow="0" w:firstColumn="0" w:lastColumn="0" w:oddVBand="0" w:evenVBand="0" w:oddHBand="0" w:evenHBand="0" w:firstRowFirstColumn="0" w:firstRowLastColumn="0" w:lastRowFirstColumn="0" w:lastRowLastColumn="0"/>
+              <w:rPr>
+                <w:vanish/>
+              </w:rPr>
+            </w:pPr>
+          </w:p>
+          <w:p>
+            <w:pPr>
+              <w:cnfStyle w:val="000000000000" w:firstRow="0" w:lastRow="0" w:firstColumn="0" w:lastColumn="0" w:oddVBand="0" w:evenVBand="0" w:oddHBand="0" w:evenHBand="0" w:firstRowFirstColumn="0" w:firstRowLastColumn="0" w:lastRowFirstColumn="0" w:lastRowLastColumn="0"/>
+              <w:rPr>
+                <w:lang w:val="vi-VN"/>
+              </w:rPr>
+            </w:pPr>
+            <w:r>
+              <w:rPr>
+                <w:lang w:val="vi-VN"/>
+              </w:rPr>
+              <w:t>Tìm kiếm đơn hàng</w:t>
+            </w:r>
+          </w:p>
+        </w:tc>
+        <w:tc>
+          <w:tcPr>
+            <w:tcW w:w="1620" w:type="dxa"/>
+          </w:tcPr>
+          <w:p>
+            <w:pPr>
+              <w:cnfStyle w:val="000000000000" w:firstRow="0" w:lastRow="0" w:firstColumn="0" w:lastColumn="0" w:oddVBand="0" w:evenVBand="0" w:oddHBand="0" w:evenHBand="0" w:firstRowFirstColumn="0" w:firstRowLastColumn="0" w:lastRowFirstColumn="0" w:lastRowLastColumn="0"/>
+            </w:pPr>
+          </w:p>
+        </w:tc>
+        <w:tc>
+          <w:tcPr>
+            <w:tcW w:w="1530" w:type="dxa"/>
+          </w:tcPr>
+          <w:p>
+            <w:pPr>
+              <w:cnfStyle w:val="000000000000" w:firstRow="0" w:lastRow="0" w:firstColumn="0" w:lastColumn="0" w:oddVBand="0" w:evenVBand="0" w:oddHBand="0" w:evenHBand="0" w:firstRowFirstColumn="0" w:firstRowLastColumn="0" w:lastRowFirstColumn="0" w:lastRowLastColumn="0"/>
+            </w:pPr>
+          </w:p>
+        </w:tc>
+        <w:tc>
+          <w:tcPr>
+            <w:tcW w:w="1874" w:type="dxa"/>
+          </w:tcPr>
+          <w:p>
+            <w:pPr>
+              <w:cnfStyle w:val="000000000000" w:firstRow="0" w:lastRow="0" w:firstColumn="0" w:lastColumn="0" w:oddVBand="0" w:evenVBand="0" w:oddHBand="0" w:evenHBand="0" w:firstRowFirstColumn="0" w:firstRowLastColumn="0" w:lastRowFirstColumn="0" w:lastRowLastColumn="0"/>
+            </w:pPr>
+          </w:p>
+        </w:tc>
+      </w:tr>
+      <w:tr>
+        <w:tc>
+          <w:tcPr>
+            <w:cnfStyle w:val="001000000000" w:firstRow="0" w:lastRow="0" w:firstColumn="1" w:lastColumn="0" w:oddVBand="0" w:evenVBand="0" w:oddHBand="0" w:evenHBand="0" w:firstRowFirstColumn="0" w:firstRowLastColumn="0" w:lastRowFirstColumn="0" w:lastRowLastColumn="0"/>
+            <w:tcW w:w="985" w:type="dxa"/>
+          </w:tcPr>
+          <w:p>
+            <w:pPr>
+              <w:pStyle w:val="ListParagraph"/>
+              <w:numPr>
+                <w:ilvl w:val="0"/>
+                <w:numId w:val="4"/>
+              </w:numPr>
+              <w:rPr>
+                <w:b w:val="0"/>
+                <w:bCs/>
+              </w:rPr>
+            </w:pPr>
+          </w:p>
+        </w:tc>
+        <w:tc>
+          <w:tcPr>
+            <w:tcW w:w="2700" w:type="dxa"/>
+          </w:tcPr>
+          <w:p>
+            <w:pPr>
+              <w:cnfStyle w:val="000000000000" w:firstRow="0" w:lastRow="0" w:firstColumn="0" w:lastColumn="0" w:oddVBand="0" w:evenVBand="0" w:oddHBand="0" w:evenHBand="0" w:firstRowFirstColumn="0" w:firstRowLastColumn="0" w:lastRowFirstColumn="0" w:lastRowLastColumn="0"/>
+              <w:rPr>
+                <w:vanish/>
+              </w:rPr>
+            </w:pPr>
+            <w:r>
+              <w:t>Theo dõi trạng thái đơn hàng</w:t>
+            </w:r>
+          </w:p>
+        </w:tc>
+        <w:tc>
+          <w:tcPr>
+            <w:tcW w:w="1620" w:type="dxa"/>
+          </w:tcPr>
+          <w:p>
+            <w:pPr>
+              <w:cnfStyle w:val="000000000000" w:firstRow="0" w:lastRow="0" w:firstColumn="0" w:lastColumn="0" w:oddVBand="0" w:evenVBand="0" w:oddHBand="0" w:evenHBand="0" w:firstRowFirstColumn="0" w:firstRowLastColumn="0" w:lastRowFirstColumn="0" w:lastRowLastColumn="0"/>
+            </w:pPr>
+          </w:p>
+        </w:tc>
+        <w:tc>
+          <w:tcPr>
+            <w:tcW w:w="1530" w:type="dxa"/>
+          </w:tcPr>
+          <w:p>
+            <w:pPr>
+              <w:cnfStyle w:val="000000000000" w:firstRow="0" w:lastRow="0" w:firstColumn="0" w:lastColumn="0" w:oddVBand="0" w:evenVBand="0" w:oddHBand="0" w:evenHBand="0" w:firstRowFirstColumn="0" w:firstRowLastColumn="0" w:lastRowFirstColumn="0" w:lastRowLastColumn="0"/>
+            </w:pPr>
+          </w:p>
+        </w:tc>
+        <w:tc>
+          <w:tcPr>
+            <w:tcW w:w="1874" w:type="dxa"/>
+          </w:tcPr>
+          <w:p>
+            <w:pPr>
+              <w:cnfStyle w:val="000000000000" w:firstRow="0" w:lastRow="0" w:firstColumn="0" w:lastColumn="0" w:oddVBand="0" w:evenVBand="0" w:oddHBand="0" w:evenHBand="0" w:firstRowFirstColumn="0" w:firstRowLastColumn="0" w:lastRowFirstColumn="0" w:lastRowLastColumn="0"/>
+            </w:pPr>
+          </w:p>
+        </w:tc>
+      </w:tr>
+      <w:tr>
+        <w:tc>
+          <w:tcPr>
+            <w:cnfStyle w:val="001000000000" w:firstRow="0" w:lastRow="0" w:firstColumn="1" w:lastColumn="0" w:oddVBand="0" w:evenVBand="0" w:oddHBand="0" w:evenHBand="0" w:firstRowFirstColumn="0" w:firstRowLastColumn="0" w:lastRowFirstColumn="0" w:lastRowLastColumn="0"/>
+            <w:tcW w:w="985" w:type="dxa"/>
+          </w:tcPr>
+          <w:p>
+            <w:pPr>
+              <w:pStyle w:val="ListParagraph"/>
+              <w:numPr>
+                <w:ilvl w:val="0"/>
+                <w:numId w:val="4"/>
+              </w:numPr>
+              <w:rPr>
+                <w:b w:val="0"/>
+                <w:bCs/>
+              </w:rPr>
+            </w:pPr>
+          </w:p>
+        </w:tc>
+        <w:tc>
+          <w:tcPr>
+            <w:tcW w:w="2700" w:type="dxa"/>
+          </w:tcPr>
+          <w:p>
+            <w:pPr>
+              <w:cnfStyle w:val="000000000000" w:firstRow="0" w:lastRow="0" w:firstColumn="0" w:lastColumn="0" w:oddVBand="0" w:evenVBand="0" w:oddHBand="0" w:evenHBand="0" w:firstRowFirstColumn="0" w:firstRowLastColumn="0" w:lastRowFirstColumn="0" w:lastRowLastColumn="0"/>
+            </w:pPr>
+            <w:r>
+              <w:t>Quản lý số lượng tồn kho</w:t>
+            </w:r>
+          </w:p>
+        </w:tc>
+        <w:tc>
+          <w:tcPr>
+            <w:tcW w:w="1620" w:type="dxa"/>
+          </w:tcPr>
+          <w:p>
+            <w:pPr>
+              <w:cnfStyle w:val="000000000000" w:firstRow="0" w:lastRow="0" w:firstColumn="0" w:lastColumn="0" w:oddVBand="0" w:evenVBand="0" w:oddHBand="0" w:evenHBand="0" w:firstRowFirstColumn="0" w:firstRowLastColumn="0" w:lastRowFirstColumn="0" w:lastRowLastColumn="0"/>
+            </w:pPr>
+          </w:p>
+        </w:tc>
+        <w:tc>
+          <w:tcPr>
+            <w:tcW w:w="1530" w:type="dxa"/>
+          </w:tcPr>
+          <w:p>
+            <w:pPr>
+              <w:cnfStyle w:val="000000000000" w:firstRow="0" w:lastRow="0" w:firstColumn="0" w:lastColumn="0" w:oddVBand="0" w:evenVBand="0" w:oddHBand="0" w:evenHBand="0" w:firstRowFirstColumn="0" w:firstRowLastColumn="0" w:lastRowFirstColumn="0" w:lastRowLastColumn="0"/>
+            </w:pPr>
+          </w:p>
+        </w:tc>
+        <w:tc>
+          <w:tcPr>
+            <w:tcW w:w="1874" w:type="dxa"/>
+          </w:tcPr>
+          <w:p>
+            <w:pPr>
+              <w:cnfStyle w:val="000000000000" w:firstRow="0" w:lastRow="0" w:firstColumn="0" w:lastColumn="0" w:oddVBand="0" w:evenVBand="0" w:oddHBand="0" w:evenHBand="0" w:firstRowFirstColumn="0" w:firstRowLastColumn="0" w:lastRowFirstColumn="0" w:lastRowLastColumn="0"/>
+            </w:pPr>
+          </w:p>
+        </w:tc>
+      </w:tr>
+      <w:tr>
+        <w:tc>
+          <w:tcPr>
+            <w:cnfStyle w:val="001000000000" w:firstRow="0" w:lastRow="0" w:firstColumn="1" w:lastColumn="0" w:oddVBand="0" w:evenVBand="0" w:oddHBand="0" w:evenHBand="0" w:firstRowFirstColumn="0" w:firstRowLastColumn="0" w:lastRowFirstColumn="0" w:lastRowLastColumn="0"/>
+            <w:tcW w:w="985" w:type="dxa"/>
+          </w:tcPr>
+          <w:p>
+            <w:pPr>
+              <w:pStyle w:val="ListParagraph"/>
+              <w:numPr>
+                <w:ilvl w:val="0"/>
+                <w:numId w:val="4"/>
+              </w:numPr>
+              <w:rPr>
+                <w:b w:val="0"/>
+                <w:bCs/>
+              </w:rPr>
+            </w:pPr>
+          </w:p>
+        </w:tc>
+        <w:tc>
+          <w:tcPr>
+            <w:tcW w:w="2700" w:type="dxa"/>
+          </w:tcPr>
+          <w:p>
+            <w:pPr>
+              <w:cnfStyle w:val="000000000000" w:firstRow="0" w:lastRow="0" w:firstColumn="0" w:lastColumn="0" w:oddVBand="0" w:evenVBand="0" w:oddHBand="0" w:evenHBand="0" w:firstRowFirstColumn="0" w:firstRowLastColumn="0" w:lastRowFirstColumn="0" w:lastRowLastColumn="0"/>
+            </w:pPr>
+            <w:r>
+              <w:t>Đặt hàng</w:t>
+            </w:r>
+          </w:p>
+        </w:tc>
+        <w:tc>
+          <w:tcPr>
+            <w:tcW w:w="1620" w:type="dxa"/>
+          </w:tcPr>
+          <w:p>
+            <w:pPr>
+              <w:cnfStyle w:val="000000000000" w:firstRow="0" w:lastRow="0" w:firstColumn="0" w:lastColumn="0" w:oddVBand="0" w:evenVBand="0" w:oddHBand="0" w:evenHBand="0" w:firstRowFirstColumn="0" w:firstRowLastColumn="0" w:lastRowFirstColumn="0" w:lastRowLastColumn="0"/>
+            </w:pPr>
+          </w:p>
+        </w:tc>
+        <w:tc>
+          <w:tcPr>
+            <w:tcW w:w="1530" w:type="dxa"/>
+          </w:tcPr>
+          <w:p>
+            <w:pPr>
+              <w:cnfStyle w:val="000000000000" w:firstRow="0" w:lastRow="0" w:firstColumn="0" w:lastColumn="0" w:oddVBand="0" w:evenVBand="0" w:oddHBand="0" w:evenHBand="0" w:firstRowFirstColumn="0" w:firstRowLastColumn="0" w:lastRowFirstColumn="0" w:lastRowLastColumn="0"/>
+            </w:pPr>
+          </w:p>
+        </w:tc>
+        <w:tc>
+          <w:tcPr>
+            <w:tcW w:w="1874" w:type="dxa"/>
+          </w:tcPr>
+          <w:p>
+            <w:pPr>
+              <w:cnfStyle w:val="000000000000" w:firstRow="0" w:lastRow="0" w:firstColumn="0" w:lastColumn="0" w:oddVBand="0" w:evenVBand="0" w:oddHBand="0" w:evenHBand="0" w:firstRowFirstColumn="0" w:firstRowLastColumn="0" w:lastRowFirstColumn="0" w:lastRowLastColumn="0"/>
+            </w:pPr>
+          </w:p>
+        </w:tc>
+      </w:tr>
+      <w:tr>
+        <w:tc>
+          <w:tcPr>
+            <w:cnfStyle w:val="001000000000" w:firstRow="0" w:lastRow="0" w:firstColumn="1" w:lastColumn="0" w:oddVBand="0" w:evenVBand="0" w:oddHBand="0" w:evenHBand="0" w:firstRowFirstColumn="0" w:firstRowLastColumn="0" w:lastRowFirstColumn="0" w:lastRowLastColumn="0"/>
+            <w:tcW w:w="985" w:type="dxa"/>
+          </w:tcPr>
+          <w:p>
+            <w:pPr>
+              <w:pStyle w:val="ListParagraph"/>
+              <w:numPr>
+                <w:ilvl w:val="0"/>
+                <w:numId w:val="4"/>
+              </w:numPr>
+              <w:rPr>
+                <w:b w:val="0"/>
+                <w:bCs/>
+              </w:rPr>
+            </w:pPr>
+          </w:p>
+        </w:tc>
+        <w:tc>
+          <w:tcPr>
+            <w:tcW w:w="2700" w:type="dxa"/>
+          </w:tcPr>
+          <w:p>
+            <w:pPr>
+              <w:cnfStyle w:val="000000000000" w:firstRow="0" w:lastRow="0" w:firstColumn="0" w:lastColumn="0" w:oddVBand="0" w:evenVBand="0" w:oddHBand="0" w:evenHBand="0" w:firstRowFirstColumn="0" w:firstRowLastColumn="0" w:lastRowFirstColumn="0" w:lastRowLastColumn="0"/>
+            </w:pPr>
+            <w:r>
+              <w:t>Xem lịch sử đơn hàng</w:t>
+            </w:r>
+          </w:p>
+        </w:tc>
+        <w:tc>
+          <w:tcPr>
+            <w:tcW w:w="1620" w:type="dxa"/>
+          </w:tcPr>
+          <w:p>
+            <w:pPr>
+              <w:cnfStyle w:val="000000000000" w:firstRow="0" w:lastRow="0" w:firstColumn="0" w:lastColumn="0" w:oddVBand="0" w:evenVBand="0" w:oddHBand="0" w:evenHBand="0" w:firstRowFirstColumn="0" w:firstRowLastColumn="0" w:lastRowFirstColumn="0" w:lastRowLastColumn="0"/>
+            </w:pPr>
+          </w:p>
+        </w:tc>
+        <w:tc>
+          <w:tcPr>
+            <w:tcW w:w="1530" w:type="dxa"/>
+          </w:tcPr>
+          <w:p>
+            <w:pPr>
+              <w:cnfStyle w:val="000000000000" w:firstRow="0" w:lastRow="0" w:firstColumn="0" w:lastColumn="0" w:oddVBand="0" w:evenVBand="0" w:oddHBand="0" w:evenHBand="0" w:firstRowFirstColumn="0" w:firstRowLastColumn="0" w:lastRowFirstColumn="0" w:lastRowLastColumn="0"/>
+            </w:pPr>
+          </w:p>
+        </w:tc>
+        <w:tc>
+          <w:tcPr>
+            <w:tcW w:w="1874" w:type="dxa"/>
+          </w:tcPr>
+          <w:p>
+            <w:pPr>
+              <w:cnfStyle w:val="000000000000" w:firstRow="0" w:lastRow="0" w:firstColumn="0" w:lastColumn="0" w:oddVBand="0" w:evenVBand="0" w:oddHBand="0" w:evenHBand="0" w:firstRowFirstColumn="0" w:firstRowLastColumn="0" w:lastRowFirstColumn="0" w:lastRowLastColumn="0"/>
+            </w:pPr>
+          </w:p>
+        </w:tc>
+      </w:tr>
+      <w:tr>
+        <w:tc>
+          <w:tcPr>
+            <w:cnfStyle w:val="001000000000" w:firstRow="0" w:lastRow="0" w:firstColumn="1" w:lastColumn="0" w:oddVBand="0" w:evenVBand="0" w:oddHBand="0" w:evenHBand="0" w:firstRowFirstColumn="0" w:firstRowLastColumn="0" w:lastRowFirstColumn="0" w:lastRowLastColumn="0"/>
+            <w:tcW w:w="985" w:type="dxa"/>
+          </w:tcPr>
+          <w:p>
+            <w:pPr>
+              <w:pStyle w:val="ListParagraph"/>
+              <w:numPr>
+                <w:ilvl w:val="0"/>
+                <w:numId w:val="4"/>
+              </w:numPr>
+              <w:rPr>
+                <w:b w:val="0"/>
+                <w:bCs/>
+              </w:rPr>
+            </w:pPr>
+          </w:p>
+        </w:tc>
+        <w:tc>
+          <w:tcPr>
+            <w:tcW w:w="2700" w:type="dxa"/>
+          </w:tcPr>
+          <w:p>
+            <w:pPr>
+              <w:cnfStyle w:val="000000000000" w:firstRow="0" w:lastRow="0" w:firstColumn="0" w:lastColumn="0" w:oddVBand="0" w:evenVBand="0" w:oddHBand="0" w:evenHBand="0" w:firstRowFirstColumn="0" w:firstRowLastColumn="0" w:lastRowFirstColumn="0" w:lastRowLastColumn="0"/>
+            </w:pPr>
+            <w:r>
+              <w:t>Thống kê sản phẩm và đơn hàng</w:t>
+            </w:r>
+          </w:p>
+        </w:tc>
+        <w:tc>
+          <w:tcPr>
+            <w:tcW w:w="1620" w:type="dxa"/>
+          </w:tcPr>
+          <w:p>
+            <w:pPr>
+              <w:cnfStyle w:val="000000000000" w:firstRow="0" w:lastRow="0" w:firstColumn="0" w:lastColumn="0" w:oddVBand="0" w:evenVBand="0" w:oddHBand="0" w:evenHBand="0" w:firstRowFirstColumn="0" w:firstRowLastColumn="0" w:lastRowFirstColumn="0" w:lastRowLastColumn="0"/>
+            </w:pPr>
+          </w:p>
+        </w:tc>
+        <w:tc>
+          <w:tcPr>
+            <w:tcW w:w="1530" w:type="dxa"/>
+          </w:tcPr>
+          <w:p>
+            <w:pPr>
+              <w:cnfStyle w:val="000000000000" w:firstRow="0" w:lastRow="0" w:firstColumn="0" w:lastColumn="0" w:oddVBand="0" w:evenVBand="0" w:oddHBand="0" w:evenHBand="0" w:firstRowFirstColumn="0" w:firstRowLastColumn="0" w:lastRowFirstColumn="0" w:lastRowLastColumn="0"/>
+            </w:pPr>
+          </w:p>
+        </w:tc>
+        <w:tc>
+          <w:tcPr>
+            <w:tcW w:w="1874" w:type="dxa"/>
           </w:tcPr>
           <w:p>
             <w:pPr>
@@ -1568,6 +2673,9 @@
     <w:p>
       <w:pPr>
         <w:pStyle w:val="Heading3"/>
+        <w:rPr>
+          <w:lang w:val="vi-VN"/>
+        </w:rPr>
       </w:pPr>
       <w:r>
         <w:t xml:space="preserve">Yêu cầu </w:t>
@@ -1579,6 +2687,987 @@
         <w:t>chức năng</w:t>
       </w:r>
     </w:p>
+    <w:tbl>
+      <w:tblPr>
+        <w:tblStyle w:val="TableGrid"/>
+        <w:tblW w:w="0" w:type="auto"/>
+        <w:tblLook w:val="04A0" w:firstRow="1" w:lastRow="0" w:firstColumn="1" w:lastColumn="0" w:noHBand="0" w:noVBand="1"/>
+      </w:tblPr>
+      <w:tblGrid>
+        <w:gridCol w:w="805"/>
+        <w:gridCol w:w="2970"/>
+        <w:gridCol w:w="5003"/>
+      </w:tblGrid>
+      <w:tr>
+        <w:tc>
+          <w:tcPr>
+            <w:tcW w:w="805" w:type="dxa"/>
+            <w:hideMark/>
+          </w:tcPr>
+          <w:p>
+            <w:pPr>
+              <w:spacing w:after="160" w:line="259" w:lineRule="auto"/>
+              <w:jc w:val="center"/>
+              <w:rPr>
+                <w:rFonts w:cs="Times New Roman"/>
+                <w:b/>
+                <w:bCs/>
+                <w:sz w:val="26"/>
+                <w:szCs w:val="26"/>
+              </w:rPr>
+            </w:pPr>
+            <w:r>
+              <w:rPr>
+                <w:rFonts w:cs="Times New Roman"/>
+                <w:b/>
+                <w:bCs/>
+                <w:sz w:val="26"/>
+                <w:szCs w:val="26"/>
+              </w:rPr>
+              <w:t>STT</w:t>
+            </w:r>
+          </w:p>
+        </w:tc>
+        <w:tc>
+          <w:tcPr>
+            <w:tcW w:w="2970" w:type="dxa"/>
+            <w:hideMark/>
+          </w:tcPr>
+          <w:p>
+            <w:pPr>
+              <w:spacing w:after="160" w:line="259" w:lineRule="auto"/>
+              <w:jc w:val="center"/>
+              <w:rPr>
+                <w:rFonts w:cs="Times New Roman"/>
+                <w:b/>
+                <w:bCs/>
+                <w:sz w:val="26"/>
+                <w:szCs w:val="26"/>
+              </w:rPr>
+            </w:pPr>
+            <w:r>
+              <w:rPr>
+                <w:rFonts w:cs="Times New Roman"/>
+                <w:b/>
+                <w:bCs/>
+                <w:sz w:val="26"/>
+                <w:szCs w:val="26"/>
+              </w:rPr>
+              <w:t>Yêu cầu phi chức năng</w:t>
+            </w:r>
+          </w:p>
+        </w:tc>
+        <w:tc>
+          <w:tcPr>
+            <w:tcW w:w="5003" w:type="dxa"/>
+            <w:hideMark/>
+          </w:tcPr>
+          <w:p>
+            <w:pPr>
+              <w:spacing w:after="160" w:line="259" w:lineRule="auto"/>
+              <w:jc w:val="center"/>
+              <w:rPr>
+                <w:rFonts w:cs="Times New Roman"/>
+                <w:b/>
+                <w:bCs/>
+                <w:sz w:val="26"/>
+                <w:szCs w:val="26"/>
+              </w:rPr>
+            </w:pPr>
+            <w:r>
+              <w:rPr>
+                <w:rFonts w:cs="Times New Roman"/>
+                <w:b/>
+                <w:bCs/>
+                <w:sz w:val="26"/>
+                <w:szCs w:val="26"/>
+              </w:rPr>
+              <w:t>Mô tả</w:t>
+            </w:r>
+          </w:p>
+        </w:tc>
+      </w:tr>
+      <w:tr>
+        <w:tc>
+          <w:tcPr>
+            <w:tcW w:w="805" w:type="dxa"/>
+          </w:tcPr>
+          <w:p>
+            <w:pPr>
+              <w:pStyle w:val="ListParagraph"/>
+              <w:numPr>
+                <w:ilvl w:val="0"/>
+                <w:numId w:val="5"/>
+              </w:numPr>
+              <w:jc w:val="center"/>
+              <w:rPr>
+                <w:rFonts w:cs="Times New Roman"/>
+                <w:b/>
+                <w:bCs/>
+                <w:sz w:val="26"/>
+                <w:szCs w:val="26"/>
+              </w:rPr>
+            </w:pPr>
+          </w:p>
+        </w:tc>
+        <w:tc>
+          <w:tcPr>
+            <w:tcW w:w="2970" w:type="dxa"/>
+            <w:hideMark/>
+          </w:tcPr>
+          <w:p>
+            <w:pPr>
+              <w:spacing w:after="160" w:line="259" w:lineRule="auto"/>
+              <w:rPr>
+                <w:rFonts w:cs="Times New Roman"/>
+                <w:sz w:val="26"/>
+                <w:szCs w:val="26"/>
+              </w:rPr>
+            </w:pPr>
+            <w:r>
+              <w:rPr>
+                <w:rFonts w:cs="Times New Roman"/>
+                <w:sz w:val="26"/>
+                <w:szCs w:val="26"/>
+              </w:rPr>
+              <w:t>Hiệu năng</w:t>
+            </w:r>
+          </w:p>
+        </w:tc>
+        <w:tc>
+          <w:tcPr>
+            <w:tcW w:w="5003" w:type="dxa"/>
+            <w:hideMark/>
+          </w:tcPr>
+          <w:p>
+            <w:pPr>
+              <w:spacing w:after="160" w:line="259" w:lineRule="auto"/>
+              <w:rPr>
+                <w:rFonts w:cs="Times New Roman"/>
+                <w:sz w:val="26"/>
+                <w:szCs w:val="26"/>
+              </w:rPr>
+            </w:pPr>
+            <w:r>
+              <w:rPr>
+                <w:rFonts w:cs="Times New Roman"/>
+                <w:sz w:val="26"/>
+                <w:szCs w:val="26"/>
+              </w:rPr>
+              <w:t>Hệ thống phải phản hồi nhanh khi người dùng thực hiện các thao tác như tìm kiếm, thêm, sửa, xóa và xem dữ liệu.</w:t>
+            </w:r>
+          </w:p>
+        </w:tc>
+      </w:tr>
+      <w:tr>
+        <w:tc>
+          <w:tcPr>
+            <w:tcW w:w="805" w:type="dxa"/>
+          </w:tcPr>
+          <w:p>
+            <w:pPr>
+              <w:pStyle w:val="ListParagraph"/>
+              <w:numPr>
+                <w:ilvl w:val="0"/>
+                <w:numId w:val="5"/>
+              </w:numPr>
+              <w:jc w:val="center"/>
+              <w:rPr>
+                <w:rFonts w:cs="Times New Roman"/>
+                <w:b/>
+                <w:bCs/>
+                <w:sz w:val="26"/>
+                <w:szCs w:val="26"/>
+              </w:rPr>
+            </w:pPr>
+          </w:p>
+        </w:tc>
+        <w:tc>
+          <w:tcPr>
+            <w:tcW w:w="2970" w:type="dxa"/>
+            <w:hideMark/>
+          </w:tcPr>
+          <w:p>
+            <w:pPr>
+              <w:spacing w:after="160" w:line="259" w:lineRule="auto"/>
+              <w:rPr>
+                <w:rFonts w:cs="Times New Roman"/>
+                <w:sz w:val="26"/>
+                <w:szCs w:val="26"/>
+              </w:rPr>
+            </w:pPr>
+            <w:r>
+              <w:rPr>
+                <w:rFonts w:cs="Times New Roman"/>
+                <w:sz w:val="26"/>
+                <w:szCs w:val="26"/>
+              </w:rPr>
+              <w:t>Bảo mật</w:t>
+            </w:r>
+          </w:p>
+        </w:tc>
+        <w:tc>
+          <w:tcPr>
+            <w:tcW w:w="5003" w:type="dxa"/>
+            <w:hideMark/>
+          </w:tcPr>
+          <w:p>
+            <w:pPr>
+              <w:spacing w:after="160" w:line="259" w:lineRule="auto"/>
+              <w:rPr>
+                <w:rFonts w:cs="Times New Roman"/>
+                <w:sz w:val="26"/>
+                <w:szCs w:val="26"/>
+              </w:rPr>
+            </w:pPr>
+            <w:r>
+              <w:rPr>
+                <w:rFonts w:cs="Times New Roman"/>
+                <w:sz w:val="26"/>
+                <w:szCs w:val="26"/>
+              </w:rPr>
+              <w:t>Hệ thống phải đảm bảo an toàn thông tin người dùng và dữ liệu sản phẩm, khách hàng, đơn hàng; các chức năng phải được kiểm soát theo quyền của từng người dùng.</w:t>
+            </w:r>
+          </w:p>
+        </w:tc>
+      </w:tr>
+      <w:tr>
+        <w:tc>
+          <w:tcPr>
+            <w:tcW w:w="805" w:type="dxa"/>
+          </w:tcPr>
+          <w:p>
+            <w:pPr>
+              <w:pStyle w:val="ListParagraph"/>
+              <w:numPr>
+                <w:ilvl w:val="0"/>
+                <w:numId w:val="5"/>
+              </w:numPr>
+              <w:jc w:val="center"/>
+              <w:rPr>
+                <w:rFonts w:cs="Times New Roman"/>
+                <w:b/>
+                <w:bCs/>
+                <w:sz w:val="26"/>
+                <w:szCs w:val="26"/>
+              </w:rPr>
+            </w:pPr>
+          </w:p>
+        </w:tc>
+        <w:tc>
+          <w:tcPr>
+            <w:tcW w:w="2970" w:type="dxa"/>
+            <w:hideMark/>
+          </w:tcPr>
+          <w:p>
+            <w:pPr>
+              <w:spacing w:after="160" w:line="259" w:lineRule="auto"/>
+              <w:rPr>
+                <w:rFonts w:cs="Times New Roman"/>
+                <w:sz w:val="26"/>
+                <w:szCs w:val="26"/>
+              </w:rPr>
+            </w:pPr>
+            <w:r>
+              <w:rPr>
+                <w:rFonts w:cs="Times New Roman"/>
+                <w:sz w:val="26"/>
+                <w:szCs w:val="26"/>
+              </w:rPr>
+              <w:t>Tính chính xác</w:t>
+            </w:r>
+          </w:p>
+        </w:tc>
+        <w:tc>
+          <w:tcPr>
+            <w:tcW w:w="5003" w:type="dxa"/>
+            <w:hideMark/>
+          </w:tcPr>
+          <w:p>
+            <w:pPr>
+              <w:spacing w:after="160" w:line="259" w:lineRule="auto"/>
+              <w:rPr>
+                <w:rFonts w:cs="Times New Roman"/>
+                <w:sz w:val="26"/>
+                <w:szCs w:val="26"/>
+              </w:rPr>
+            </w:pPr>
+            <w:r>
+              <w:rPr>
+                <w:rFonts w:cs="Times New Roman"/>
+                <w:sz w:val="26"/>
+                <w:szCs w:val="26"/>
+              </w:rPr>
+              <w:t>Dữ liệu nhập vào phải được kiểm tra hợp lệ, đặc biệt đối với giá sản phẩm, số lượng tồn kho, số lượng đặt hàng và thông tin đơn hàng.</w:t>
+            </w:r>
+          </w:p>
+        </w:tc>
+      </w:tr>
+      <w:tr>
+        <w:tc>
+          <w:tcPr>
+            <w:tcW w:w="805" w:type="dxa"/>
+          </w:tcPr>
+          <w:p>
+            <w:pPr>
+              <w:pStyle w:val="ListParagraph"/>
+              <w:numPr>
+                <w:ilvl w:val="0"/>
+                <w:numId w:val="5"/>
+              </w:numPr>
+              <w:jc w:val="center"/>
+              <w:rPr>
+                <w:rFonts w:cs="Times New Roman"/>
+                <w:b/>
+                <w:bCs/>
+                <w:sz w:val="26"/>
+                <w:szCs w:val="26"/>
+              </w:rPr>
+            </w:pPr>
+          </w:p>
+        </w:tc>
+        <w:tc>
+          <w:tcPr>
+            <w:tcW w:w="2970" w:type="dxa"/>
+            <w:hideMark/>
+          </w:tcPr>
+          <w:p>
+            <w:pPr>
+              <w:spacing w:after="160" w:line="259" w:lineRule="auto"/>
+              <w:rPr>
+                <w:rFonts w:cs="Times New Roman"/>
+                <w:sz w:val="26"/>
+                <w:szCs w:val="26"/>
+              </w:rPr>
+            </w:pPr>
+            <w:r>
+              <w:rPr>
+                <w:rFonts w:cs="Times New Roman"/>
+                <w:sz w:val="26"/>
+                <w:szCs w:val="26"/>
+              </w:rPr>
+              <w:t>Tính toàn vẹn dữ liệu</w:t>
+            </w:r>
+          </w:p>
+        </w:tc>
+        <w:tc>
+          <w:tcPr>
+            <w:tcW w:w="5003" w:type="dxa"/>
+            <w:hideMark/>
+          </w:tcPr>
+          <w:p>
+            <w:pPr>
+              <w:spacing w:after="160" w:line="259" w:lineRule="auto"/>
+              <w:rPr>
+                <w:rFonts w:cs="Times New Roman"/>
+                <w:sz w:val="26"/>
+                <w:szCs w:val="26"/>
+              </w:rPr>
+            </w:pPr>
+            <w:r>
+              <w:rPr>
+                <w:rFonts w:cs="Times New Roman"/>
+                <w:sz w:val="26"/>
+                <w:szCs w:val="26"/>
+              </w:rPr>
+              <w:t xml:space="preserve">Hệ thống phải đảm bảo mối quan hệ giữa sản phẩm, danh mục, nhà cung cấp, khách hàng, </w:t>
+            </w:r>
+            <w:r>
+              <w:rPr>
+                <w:rFonts w:cs="Times New Roman"/>
+                <w:sz w:val="26"/>
+                <w:szCs w:val="26"/>
+              </w:rPr>
+              <w:lastRenderedPageBreak/>
+              <w:t>đơn hàng và chi tiết đơn hàng được duy trì chính xác trong MySQL.</w:t>
+            </w:r>
+          </w:p>
+        </w:tc>
+      </w:tr>
+      <w:tr>
+        <w:tc>
+          <w:tcPr>
+            <w:tcW w:w="805" w:type="dxa"/>
+          </w:tcPr>
+          <w:p>
+            <w:pPr>
+              <w:pStyle w:val="ListParagraph"/>
+              <w:numPr>
+                <w:ilvl w:val="0"/>
+                <w:numId w:val="5"/>
+              </w:numPr>
+              <w:jc w:val="center"/>
+              <w:rPr>
+                <w:rFonts w:cs="Times New Roman"/>
+                <w:b/>
+                <w:bCs/>
+                <w:sz w:val="26"/>
+                <w:szCs w:val="26"/>
+              </w:rPr>
+            </w:pPr>
+          </w:p>
+        </w:tc>
+        <w:tc>
+          <w:tcPr>
+            <w:tcW w:w="2970" w:type="dxa"/>
+            <w:hideMark/>
+          </w:tcPr>
+          <w:p>
+            <w:pPr>
+              <w:spacing w:after="160" w:line="259" w:lineRule="auto"/>
+              <w:rPr>
+                <w:rFonts w:cs="Times New Roman"/>
+                <w:sz w:val="26"/>
+                <w:szCs w:val="26"/>
+              </w:rPr>
+            </w:pPr>
+            <w:r>
+              <w:rPr>
+                <w:rFonts w:cs="Times New Roman"/>
+                <w:sz w:val="26"/>
+                <w:szCs w:val="26"/>
+              </w:rPr>
+              <w:t>Tính nhất quán</w:t>
+            </w:r>
+          </w:p>
+        </w:tc>
+        <w:tc>
+          <w:tcPr>
+            <w:tcW w:w="5003" w:type="dxa"/>
+            <w:hideMark/>
+          </w:tcPr>
+          <w:p>
+            <w:pPr>
+              <w:spacing w:after="160" w:line="259" w:lineRule="auto"/>
+              <w:rPr>
+                <w:rFonts w:cs="Times New Roman"/>
+                <w:sz w:val="26"/>
+                <w:szCs w:val="26"/>
+              </w:rPr>
+            </w:pPr>
+            <w:r>
+              <w:rPr>
+                <w:rFonts w:cs="Times New Roman"/>
+                <w:sz w:val="26"/>
+                <w:szCs w:val="26"/>
+              </w:rPr>
+              <w:t>Khi dữ liệu được thêm, sửa hoặc xóa, các thông tin liên quan phải được cập nhật phù hợp, tránh tạo ra dữ liệu sai lệch hoặc trùng lặp.</w:t>
+            </w:r>
+          </w:p>
+        </w:tc>
+      </w:tr>
+      <w:tr>
+        <w:tc>
+          <w:tcPr>
+            <w:tcW w:w="805" w:type="dxa"/>
+          </w:tcPr>
+          <w:p>
+            <w:pPr>
+              <w:pStyle w:val="ListParagraph"/>
+              <w:numPr>
+                <w:ilvl w:val="0"/>
+                <w:numId w:val="5"/>
+              </w:numPr>
+              <w:jc w:val="center"/>
+              <w:rPr>
+                <w:rFonts w:cs="Times New Roman"/>
+                <w:b/>
+                <w:bCs/>
+                <w:sz w:val="26"/>
+                <w:szCs w:val="26"/>
+              </w:rPr>
+            </w:pPr>
+          </w:p>
+        </w:tc>
+        <w:tc>
+          <w:tcPr>
+            <w:tcW w:w="2970" w:type="dxa"/>
+            <w:hideMark/>
+          </w:tcPr>
+          <w:p>
+            <w:pPr>
+              <w:spacing w:after="160" w:line="259" w:lineRule="auto"/>
+              <w:rPr>
+                <w:rFonts w:cs="Times New Roman"/>
+                <w:sz w:val="26"/>
+                <w:szCs w:val="26"/>
+              </w:rPr>
+            </w:pPr>
+            <w:r>
+              <w:rPr>
+                <w:rFonts w:cs="Times New Roman"/>
+                <w:sz w:val="26"/>
+                <w:szCs w:val="26"/>
+              </w:rPr>
+              <w:t>Tính dễ sử dụng</w:t>
+            </w:r>
+          </w:p>
+        </w:tc>
+        <w:tc>
+          <w:tcPr>
+            <w:tcW w:w="5003" w:type="dxa"/>
+            <w:hideMark/>
+          </w:tcPr>
+          <w:p>
+            <w:pPr>
+              <w:spacing w:after="160" w:line="259" w:lineRule="auto"/>
+              <w:rPr>
+                <w:rFonts w:cs="Times New Roman"/>
+                <w:sz w:val="26"/>
+                <w:szCs w:val="26"/>
+              </w:rPr>
+            </w:pPr>
+            <w:r>
+              <w:rPr>
+                <w:rFonts w:cs="Times New Roman"/>
+                <w:sz w:val="26"/>
+                <w:szCs w:val="26"/>
+              </w:rPr>
+              <w:t>Giao diện phải đơn giản, rõ ràng, dễ thao tác và phù hợp với các đối tượng như quản trị viên, nhân viên và khách hàng.</w:t>
+            </w:r>
+          </w:p>
+        </w:tc>
+      </w:tr>
+      <w:tr>
+        <w:tc>
+          <w:tcPr>
+            <w:tcW w:w="805" w:type="dxa"/>
+          </w:tcPr>
+          <w:p>
+            <w:pPr>
+              <w:pStyle w:val="ListParagraph"/>
+              <w:numPr>
+                <w:ilvl w:val="0"/>
+                <w:numId w:val="5"/>
+              </w:numPr>
+              <w:jc w:val="center"/>
+              <w:rPr>
+                <w:rFonts w:cs="Times New Roman"/>
+                <w:b/>
+                <w:bCs/>
+                <w:sz w:val="26"/>
+                <w:szCs w:val="26"/>
+              </w:rPr>
+            </w:pPr>
+          </w:p>
+        </w:tc>
+        <w:tc>
+          <w:tcPr>
+            <w:tcW w:w="2970" w:type="dxa"/>
+            <w:hideMark/>
+          </w:tcPr>
+          <w:p>
+            <w:pPr>
+              <w:spacing w:after="160" w:line="259" w:lineRule="auto"/>
+              <w:rPr>
+                <w:rFonts w:cs="Times New Roman"/>
+                <w:sz w:val="26"/>
+                <w:szCs w:val="26"/>
+              </w:rPr>
+            </w:pPr>
+            <w:r>
+              <w:rPr>
+                <w:rFonts w:cs="Times New Roman"/>
+                <w:sz w:val="26"/>
+                <w:szCs w:val="26"/>
+              </w:rPr>
+              <w:t>Tính tương thích</w:t>
+            </w:r>
+          </w:p>
+        </w:tc>
+        <w:tc>
+          <w:tcPr>
+            <w:tcW w:w="5003" w:type="dxa"/>
+            <w:hideMark/>
+          </w:tcPr>
+          <w:p>
+            <w:pPr>
+              <w:spacing w:after="160" w:line="259" w:lineRule="auto"/>
+              <w:rPr>
+                <w:rFonts w:cs="Times New Roman"/>
+                <w:sz w:val="26"/>
+                <w:szCs w:val="26"/>
+              </w:rPr>
+            </w:pPr>
+            <w:r>
+              <w:rPr>
+                <w:rFonts w:cs="Times New Roman"/>
+                <w:sz w:val="26"/>
+                <w:szCs w:val="26"/>
+              </w:rPr>
+              <w:t>Hệ thống có thể hoạt động ổn định trên các trình duyệt phổ biến như Chrome, Edge và Firefox.</w:t>
+            </w:r>
+          </w:p>
+        </w:tc>
+      </w:tr>
+      <w:tr>
+        <w:tc>
+          <w:tcPr>
+            <w:tcW w:w="805" w:type="dxa"/>
+          </w:tcPr>
+          <w:p>
+            <w:pPr>
+              <w:pStyle w:val="ListParagraph"/>
+              <w:numPr>
+                <w:ilvl w:val="0"/>
+                <w:numId w:val="5"/>
+              </w:numPr>
+              <w:jc w:val="center"/>
+              <w:rPr>
+                <w:rFonts w:cs="Times New Roman"/>
+                <w:b/>
+                <w:bCs/>
+                <w:sz w:val="26"/>
+                <w:szCs w:val="26"/>
+              </w:rPr>
+            </w:pPr>
+          </w:p>
+        </w:tc>
+        <w:tc>
+          <w:tcPr>
+            <w:tcW w:w="2970" w:type="dxa"/>
+            <w:hideMark/>
+          </w:tcPr>
+          <w:p>
+            <w:pPr>
+              <w:spacing w:after="160" w:line="259" w:lineRule="auto"/>
+              <w:rPr>
+                <w:rFonts w:cs="Times New Roman"/>
+                <w:sz w:val="26"/>
+                <w:szCs w:val="26"/>
+              </w:rPr>
+            </w:pPr>
+            <w:r>
+              <w:rPr>
+                <w:rFonts w:cs="Times New Roman"/>
+                <w:sz w:val="26"/>
+                <w:szCs w:val="26"/>
+              </w:rPr>
+              <w:t>Tính ổn định</w:t>
+            </w:r>
+          </w:p>
+        </w:tc>
+        <w:tc>
+          <w:tcPr>
+            <w:tcW w:w="5003" w:type="dxa"/>
+            <w:hideMark/>
+          </w:tcPr>
+          <w:p>
+            <w:pPr>
+              <w:spacing w:after="160" w:line="259" w:lineRule="auto"/>
+              <w:rPr>
+                <w:rFonts w:cs="Times New Roman"/>
+                <w:sz w:val="26"/>
+                <w:szCs w:val="26"/>
+              </w:rPr>
+            </w:pPr>
+            <w:r>
+              <w:rPr>
+                <w:rFonts w:cs="Times New Roman"/>
+                <w:sz w:val="26"/>
+                <w:szCs w:val="26"/>
+              </w:rPr>
+              <w:t>Hệ thống phải hoạt động ổn định trong quá trình quản lý sản phẩm và đơn hàng, hạn chế lỗi làm gián đoạn hoạt động của người dùng.</w:t>
+            </w:r>
+          </w:p>
+        </w:tc>
+      </w:tr>
+      <w:tr>
+        <w:tc>
+          <w:tcPr>
+            <w:tcW w:w="805" w:type="dxa"/>
+          </w:tcPr>
+          <w:p>
+            <w:pPr>
+              <w:pStyle w:val="ListParagraph"/>
+              <w:numPr>
+                <w:ilvl w:val="0"/>
+                <w:numId w:val="5"/>
+              </w:numPr>
+              <w:jc w:val="center"/>
+              <w:rPr>
+                <w:rFonts w:cs="Times New Roman"/>
+                <w:b/>
+                <w:bCs/>
+                <w:sz w:val="26"/>
+                <w:szCs w:val="26"/>
+              </w:rPr>
+            </w:pPr>
+          </w:p>
+        </w:tc>
+        <w:tc>
+          <w:tcPr>
+            <w:tcW w:w="2970" w:type="dxa"/>
+            <w:hideMark/>
+          </w:tcPr>
+          <w:p>
+            <w:pPr>
+              <w:spacing w:after="160" w:line="259" w:lineRule="auto"/>
+              <w:rPr>
+                <w:rFonts w:cs="Times New Roman"/>
+                <w:sz w:val="26"/>
+                <w:szCs w:val="26"/>
+              </w:rPr>
+            </w:pPr>
+            <w:r>
+              <w:rPr>
+                <w:rFonts w:cs="Times New Roman"/>
+                <w:sz w:val="26"/>
+                <w:szCs w:val="26"/>
+              </w:rPr>
+              <w:t>Khả năng mở rộng</w:t>
+            </w:r>
+          </w:p>
+        </w:tc>
+        <w:tc>
+          <w:tcPr>
+            <w:tcW w:w="5003" w:type="dxa"/>
+            <w:hideMark/>
+          </w:tcPr>
+          <w:p>
+            <w:pPr>
+              <w:spacing w:after="160" w:line="259" w:lineRule="auto"/>
+              <w:rPr>
+                <w:rFonts w:cs="Times New Roman"/>
+                <w:sz w:val="26"/>
+                <w:szCs w:val="26"/>
+              </w:rPr>
+            </w:pPr>
+            <w:r>
+              <w:rPr>
+                <w:rFonts w:cs="Times New Roman"/>
+                <w:sz w:val="26"/>
+                <w:szCs w:val="26"/>
+              </w:rPr>
+              <w:t>Kiến trúc hệ thống và cơ sở dữ liệu phải cho phép bổ sung thêm sản phẩm, danh mục, khách hàng, nhân viên và các chức năng mới trong tương lai.</w:t>
+            </w:r>
+          </w:p>
+        </w:tc>
+      </w:tr>
+      <w:tr>
+        <w:tc>
+          <w:tcPr>
+            <w:tcW w:w="805" w:type="dxa"/>
+          </w:tcPr>
+          <w:p>
+            <w:pPr>
+              <w:pStyle w:val="ListParagraph"/>
+              <w:numPr>
+                <w:ilvl w:val="0"/>
+                <w:numId w:val="5"/>
+              </w:numPr>
+              <w:jc w:val="center"/>
+              <w:rPr>
+                <w:rFonts w:cs="Times New Roman"/>
+                <w:b/>
+                <w:bCs/>
+                <w:sz w:val="26"/>
+                <w:szCs w:val="26"/>
+              </w:rPr>
+            </w:pPr>
+          </w:p>
+        </w:tc>
+        <w:tc>
+          <w:tcPr>
+            <w:tcW w:w="2970" w:type="dxa"/>
+            <w:hideMark/>
+          </w:tcPr>
+          <w:p>
+            <w:pPr>
+              <w:spacing w:after="160" w:line="259" w:lineRule="auto"/>
+              <w:rPr>
+                <w:rFonts w:cs="Times New Roman"/>
+                <w:sz w:val="26"/>
+                <w:szCs w:val="26"/>
+              </w:rPr>
+            </w:pPr>
+            <w:r>
+              <w:rPr>
+                <w:rFonts w:cs="Times New Roman"/>
+                <w:sz w:val="26"/>
+                <w:szCs w:val="26"/>
+              </w:rPr>
+              <w:t>Khả năng bảo trì</w:t>
+            </w:r>
+          </w:p>
+        </w:tc>
+        <w:tc>
+          <w:tcPr>
+            <w:tcW w:w="5003" w:type="dxa"/>
+            <w:hideMark/>
+          </w:tcPr>
+          <w:p>
+            <w:pPr>
+              <w:spacing w:after="160" w:line="259" w:lineRule="auto"/>
+              <w:rPr>
+                <w:rFonts w:cs="Times New Roman"/>
+                <w:sz w:val="26"/>
+                <w:szCs w:val="26"/>
+              </w:rPr>
+            </w:pPr>
+            <w:r>
+              <w:rPr>
+                <w:rFonts w:cs="Times New Roman"/>
+                <w:sz w:val="26"/>
+                <w:szCs w:val="26"/>
+              </w:rPr>
+              <w:t>Mã nguồn phải được tổ chức rõ ràng, dễ đọc và dễ sửa đổi, giúp thuận tiện cho việc bảo trì và nâng cấp hệ thống.</w:t>
+            </w:r>
+          </w:p>
+        </w:tc>
+      </w:tr>
+      <w:tr>
+        <w:tc>
+          <w:tcPr>
+            <w:tcW w:w="805" w:type="dxa"/>
+          </w:tcPr>
+          <w:p>
+            <w:pPr>
+              <w:pStyle w:val="ListParagraph"/>
+              <w:numPr>
+                <w:ilvl w:val="0"/>
+                <w:numId w:val="5"/>
+              </w:numPr>
+              <w:jc w:val="center"/>
+              <w:rPr>
+                <w:rFonts w:cs="Times New Roman"/>
+                <w:b/>
+                <w:bCs/>
+                <w:sz w:val="26"/>
+                <w:szCs w:val="26"/>
+              </w:rPr>
+            </w:pPr>
+          </w:p>
+        </w:tc>
+        <w:tc>
+          <w:tcPr>
+            <w:tcW w:w="2970" w:type="dxa"/>
+            <w:hideMark/>
+          </w:tcPr>
+          <w:p>
+            <w:pPr>
+              <w:spacing w:after="160" w:line="259" w:lineRule="auto"/>
+              <w:rPr>
+                <w:rFonts w:cs="Times New Roman"/>
+                <w:sz w:val="26"/>
+                <w:szCs w:val="26"/>
+              </w:rPr>
+            </w:pPr>
+            <w:r>
+              <w:rPr>
+                <w:rFonts w:cs="Times New Roman"/>
+                <w:sz w:val="26"/>
+                <w:szCs w:val="26"/>
+              </w:rPr>
+              <w:t>Sao lưu và phục hồi</w:t>
+            </w:r>
+          </w:p>
+        </w:tc>
+        <w:tc>
+          <w:tcPr>
+            <w:tcW w:w="5003" w:type="dxa"/>
+            <w:hideMark/>
+          </w:tcPr>
+          <w:p>
+            <w:pPr>
+              <w:spacing w:after="160" w:line="259" w:lineRule="auto"/>
+              <w:rPr>
+                <w:rFonts w:cs="Times New Roman"/>
+                <w:sz w:val="26"/>
+                <w:szCs w:val="26"/>
+              </w:rPr>
+            </w:pPr>
+            <w:r>
+              <w:rPr>
+                <w:rFonts w:cs="Times New Roman"/>
+                <w:sz w:val="26"/>
+                <w:szCs w:val="26"/>
+              </w:rPr>
+              <w:t>Dữ liệu quan trọng cần được sao lưu định kỳ và có khả năng phục hồi khi xảy ra sự cố.</w:t>
+            </w:r>
+          </w:p>
+        </w:tc>
+      </w:tr>
+      <w:tr>
+        <w:tc>
+          <w:tcPr>
+            <w:tcW w:w="805" w:type="dxa"/>
+          </w:tcPr>
+          <w:p>
+            <w:pPr>
+              <w:pStyle w:val="ListParagraph"/>
+              <w:numPr>
+                <w:ilvl w:val="0"/>
+                <w:numId w:val="5"/>
+              </w:numPr>
+              <w:jc w:val="center"/>
+              <w:rPr>
+                <w:rFonts w:cs="Times New Roman"/>
+                <w:b/>
+                <w:bCs/>
+                <w:sz w:val="26"/>
+                <w:szCs w:val="26"/>
+              </w:rPr>
+            </w:pPr>
+          </w:p>
+        </w:tc>
+        <w:tc>
+          <w:tcPr>
+            <w:tcW w:w="2970" w:type="dxa"/>
+            <w:hideMark/>
+          </w:tcPr>
+          <w:p>
+            <w:pPr>
+              <w:spacing w:after="160" w:line="259" w:lineRule="auto"/>
+              <w:rPr>
+                <w:rFonts w:cs="Times New Roman"/>
+                <w:sz w:val="26"/>
+                <w:szCs w:val="26"/>
+              </w:rPr>
+            </w:pPr>
+            <w:r>
+              <w:rPr>
+                <w:rFonts w:cs="Times New Roman"/>
+                <w:sz w:val="26"/>
+                <w:szCs w:val="26"/>
+              </w:rPr>
+              <w:t>Khả năng tìm kiếm</w:t>
+            </w:r>
+          </w:p>
+        </w:tc>
+        <w:tc>
+          <w:tcPr>
+            <w:tcW w:w="5003" w:type="dxa"/>
+            <w:hideMark/>
+          </w:tcPr>
+          <w:p>
+            <w:pPr>
+              <w:spacing w:after="160" w:line="259" w:lineRule="auto"/>
+              <w:rPr>
+                <w:rFonts w:cs="Times New Roman"/>
+                <w:sz w:val="26"/>
+                <w:szCs w:val="26"/>
+              </w:rPr>
+            </w:pPr>
+            <w:r>
+              <w:rPr>
+                <w:rFonts w:cs="Times New Roman"/>
+                <w:sz w:val="26"/>
+                <w:szCs w:val="26"/>
+              </w:rPr>
+              <w:t>Việc tìm kiếm và lọc dữ liệu phải cho kết quả chính xác, nhanh chóng ngay cả khi số lượng sản phẩm và đơn hàng tăng lên.</w:t>
+            </w:r>
+          </w:p>
+        </w:tc>
+      </w:tr>
+    </w:tbl>
+    <w:p>
+      <w:pPr>
+        <w:rPr>
+          <w:lang w:val="vi-VN"/>
+        </w:rPr>
+      </w:pPr>
+    </w:p>
     <w:p>
       <w:pPr>
         <w:pStyle w:val="Heading2"/>
@@ -1602,32 +3691,32 @@
         <w:pStyle w:val="Heading2"/>
       </w:pPr>
       <w:r>
+        <w:t>Phân tích thiết kế</w:t>
+      </w:r>
+    </w:p>
+    <w:p>
+      <w:pPr>
+        <w:pStyle w:val="Heading3"/>
+      </w:pPr>
+      <w:r>
+        <w:t>Thiết kế dữ liệu</w:t>
+      </w:r>
+    </w:p>
+    <w:p>
+      <w:pPr>
+        <w:pStyle w:val="Heading4"/>
+      </w:pPr>
+      <w:r>
+        <w:t>Mô hình ERD</w:t>
+      </w:r>
+    </w:p>
+    <w:p/>
+    <w:p>
+      <w:pPr>
+        <w:pStyle w:val="Heading4"/>
+      </w:pPr>
+      <w:r>
         <w:lastRenderedPageBreak/>
-        <w:t>Phân tích thiết kế</w:t>
-      </w:r>
-    </w:p>
-    <w:p>
-      <w:pPr>
-        <w:pStyle w:val="Heading3"/>
-      </w:pPr>
-      <w:r>
-        <w:t>Thiết kế dữ liệu</w:t>
-      </w:r>
-    </w:p>
-    <w:p>
-      <w:pPr>
-        <w:pStyle w:val="Heading4"/>
-      </w:pPr>
-      <w:r>
-        <w:t>Mô hình ERD</w:t>
-      </w:r>
-    </w:p>
-    <w:p/>
-    <w:p>
-      <w:pPr>
-        <w:pStyle w:val="Heading4"/>
-      </w:pPr>
-      <w:r>
         <w:t>Chi tiết các thực thể</w:t>
       </w:r>
     </w:p>
@@ -2667,7 +4756,6 @@
           </w:tcPr>
           <w:p>
             <w:r>
-              <w:lastRenderedPageBreak/>
               <w:t>8</w:t>
             </w:r>
           </w:p>
@@ -2886,6 +4974,7 @@
           </w:tcPr>
           <w:p>
             <w:r>
+              <w:lastRenderedPageBreak/>
               <w:t>2</w:t>
             </w:r>
           </w:p>
@@ -3579,7 +5668,7 @@
 </file>
 
 <file path=word/endnotes.xml><?xml version="1.0" encoding="utf-8"?>
-<w:endnotes xmlns:wpc="http://schemas.microsoft.com/office/word/2010/wordprocessingCanvas" xmlns:mc="http://schemas.openxmlformats.org/markup-compatibility/2006" xmlns:o="urn:schemas-microsoft-com:office:office" xmlns:r="http://schemas.openxmlformats.org/officeDocument/2006/relationships" xmlns:m="http://schemas.openxmlformats.org/officeDocument/2006/math" xmlns:v="urn:schemas-microsoft-com:vml" xmlns:wp14="http://schemas.microsoft.com/office/word/2010/wordprocessingDrawing" xmlns:wp="http://schemas.openxmlformats.org/drawingml/2006/wordprocessingDrawing" xmlns:w10="urn:schemas-microsoft-com:office:word" xmlns:w="http://schemas.openxmlformats.org/wordprocessingml/2006/main" xmlns:w14="http://schemas.microsoft.com/office/word/2010/wordml" xmlns:w15="http://schemas.microsoft.com/office/word/2012/wordml" xmlns:wpg="http://schemas.microsoft.com/office/word/2010/wordprocessingGroup" xmlns:wpi="http://schemas.microsoft.com/office/word/2010/wordprocessingInk" xmlns:wne="http://schemas.microsoft.com/office/word/2006/wordml" xmlns:wps="http://schemas.microsoft.com/office/word/2010/wordprocessingShape" mc:Ignorable="w14 w15 wp14">
+<w:endnotes xmlns:wpc="http://schemas.microsoft.com/office/word/2010/wordprocessingCanvas" xmlns:cx="http://schemas.microsoft.com/office/drawing/2014/chartex" xmlns:cx1="http://schemas.microsoft.com/office/drawing/2015/9/8/chartex" xmlns:cx2="http://schemas.microsoft.com/office/drawing/2015/10/21/chartex" xmlns:cx3="http://schemas.microsoft.com/office/drawing/2016/5/9/chartex" xmlns:cx4="http://schemas.microsoft.com/office/drawing/2016/5/10/chartex" xmlns:cx5="http://schemas.microsoft.com/office/drawing/2016/5/11/chartex" xmlns:cx6="http://schemas.microsoft.com/office/drawing/2016/5/12/chartex" xmlns:cx7="http://schemas.microsoft.com/office/drawing/2016/5/13/chartex" xmlns:cx8="http://schemas.microsoft.com/office/drawing/2016/5/14/chartex" xmlns:mc="http://schemas.openxmlformats.org/markup-compatibility/2006" xmlns:aink="http://schemas.microsoft.com/office/drawing/2016/ink" xmlns:am3d="http://schemas.microsoft.com/office/drawing/2017/model3d" xmlns:o="urn:schemas-microsoft-com:office:office" xmlns:oel="http://schemas.microsoft.com/office/2019/extlst" xmlns:r="http://schemas.openxmlformats.org/officeDocument/2006/relationships" xmlns:m="http://schemas.openxmlformats.org/officeDocument/2006/math" xmlns:v="urn:schemas-microsoft-com:vml" xmlns:wp14="http://schemas.microsoft.com/office/word/2010/wordprocessingDrawing" xmlns:wp="http://schemas.openxmlformats.org/drawingml/2006/wordprocessingDrawing" xmlns:w10="urn:schemas-microsoft-com:office:word" xmlns:w="http://schemas.openxmlformats.org/wordprocessingml/2006/main" xmlns:w14="http://schemas.microsoft.com/office/word/2010/wordml" xmlns:w15="http://schemas.microsoft.com/office/word/2012/wordml" xmlns:w16cex="http://schemas.microsoft.com/office/word/2018/wordml/cex" xmlns:w16cid="http://schemas.microsoft.com/office/word/2016/wordml/cid" xmlns:w16="http://schemas.microsoft.com/office/word/2018/wordml" xmlns:w16du="http://schemas.microsoft.com/office/word/2023/wordml/word16du" xmlns:w16sdtdh="http://schemas.microsoft.com/office/word/2020/wordml/sdtdatahash" xmlns:w16sdtfl="http://schemas.microsoft.com/office/word/2024/wordml/sdtformatlock" xmlns:w16se="http://schemas.microsoft.com/office/word/2015/wordml/symex" xmlns:wpg="http://schemas.microsoft.com/office/word/2010/wordprocessingGroup" xmlns:wpi="http://schemas.microsoft.com/office/word/2010/wordprocessingInk" xmlns:wne="http://schemas.microsoft.com/office/word/2006/wordml" xmlns:wps="http://schemas.microsoft.com/office/word/2010/wordprocessingShape" mc:Ignorable="w14 w15 w16se w16cid w16 w16cex w16sdtdh w16sdtfl w16du wp14">
   <w:endnote w:type="separator" w:id="-1">
     <w:p>
       <w:pPr>
@@ -3604,7 +5693,7 @@
 </file>
 
 <file path=word/footnotes.xml><?xml version="1.0" encoding="utf-8"?>
-<w:footnotes xmlns:wpc="http://schemas.microsoft.com/office/word/2010/wordprocessingCanvas" xmlns:mc="http://schemas.openxmlformats.org/markup-compatibility/2006" xmlns:o="urn:schemas-microsoft-com:office:office" xmlns:r="http://schemas.openxmlformats.org/officeDocument/2006/relationships" xmlns:m="http://schemas.openxmlformats.org/officeDocument/2006/math" xmlns:v="urn:schemas-microsoft-com:vml" xmlns:wp14="http://schemas.microsoft.com/office/word/2010/wordprocessingDrawing" xmlns:wp="http://schemas.openxmlformats.org/drawingml/2006/wordprocessingDrawing" xmlns:w10="urn:schemas-microsoft-com:office:word" xmlns:w="http://schemas.openxmlformats.org/wordprocessingml/2006/main" xmlns:w14="http://schemas.microsoft.com/office/word/2010/wordml" xmlns:w15="http://schemas.microsoft.com/office/word/2012/wordml" xmlns:wpg="http://schemas.microsoft.com/office/word/2010/wordprocessingGroup" xmlns:wpi="http://schemas.microsoft.com/office/word/2010/wordprocessingInk" xmlns:wne="http://schemas.microsoft.com/office/word/2006/wordml" xmlns:wps="http://schemas.microsoft.com/office/word/2010/wordprocessingShape" mc:Ignorable="w14 w15 wp14">
+<w:footnotes xmlns:wpc="http://schemas.microsoft.com/office/word/2010/wordprocessingCanvas" xmlns:cx="http://schemas.microsoft.com/office/drawing/2014/chartex" xmlns:cx1="http://schemas.microsoft.com/office/drawing/2015/9/8/chartex" xmlns:cx2="http://schemas.microsoft.com/office/drawing/2015/10/21/chartex" xmlns:cx3="http://schemas.microsoft.com/office/drawing/2016/5/9/chartex" xmlns:cx4="http://schemas.microsoft.com/office/drawing/2016/5/10/chartex" xmlns:cx5="http://schemas.microsoft.com/office/drawing/2016/5/11/chartex" xmlns:cx6="http://schemas.microsoft.com/office/drawing/2016/5/12/chartex" xmlns:cx7="http://schemas.microsoft.com/office/drawing/2016/5/13/chartex" xmlns:cx8="http://schemas.microsoft.com/office/drawing/2016/5/14/chartex" xmlns:mc="http://schemas.openxmlformats.org/markup-compatibility/2006" xmlns:aink="http://schemas.microsoft.com/office/drawing/2016/ink" xmlns:am3d="http://schemas.microsoft.com/office/drawing/2017/model3d" xmlns:o="urn:schemas-microsoft-com:office:office" xmlns:oel="http://schemas.microsoft.com/office/2019/extlst" xmlns:r="http://schemas.openxmlformats.org/officeDocument/2006/relationships" xmlns:m="http://schemas.openxmlformats.org/officeDocument/2006/math" xmlns:v="urn:schemas-microsoft-com:vml" xmlns:wp14="http://schemas.microsoft.com/office/word/2010/wordprocessingDrawing" xmlns:wp="http://schemas.openxmlformats.org/drawingml/2006/wordprocessingDrawing" xmlns:w10="urn:schemas-microsoft-com:office:word" xmlns:w="http://schemas.openxmlformats.org/wordprocessingml/2006/main" xmlns:w14="http://schemas.microsoft.com/office/word/2010/wordml" xmlns:w15="http://schemas.microsoft.com/office/word/2012/wordml" xmlns:w16cex="http://schemas.microsoft.com/office/word/2018/wordml/cex" xmlns:w16cid="http://schemas.microsoft.com/office/word/2016/wordml/cid" xmlns:w16="http://schemas.microsoft.com/office/word/2018/wordml" xmlns:w16du="http://schemas.microsoft.com/office/word/2023/wordml/word16du" xmlns:w16sdtdh="http://schemas.microsoft.com/office/word/2020/wordml/sdtdatahash" xmlns:w16sdtfl="http://schemas.microsoft.com/office/word/2024/wordml/sdtformatlock" xmlns:w16se="http://schemas.microsoft.com/office/word/2015/wordml/symex" xmlns:wpg="http://schemas.microsoft.com/office/word/2010/wordprocessingGroup" xmlns:wpi="http://schemas.microsoft.com/office/word/2010/wordprocessingInk" xmlns:wne="http://schemas.microsoft.com/office/word/2006/wordml" xmlns:wps="http://schemas.microsoft.com/office/word/2010/wordprocessingShape" mc:Ignorable="w14 w15 w16se w16cid w16 w16cex w16sdtdh w16sdtfl w16du wp14">
   <w:footnote w:type="separator" w:id="-1">
     <w:p>
       <w:pPr>
@@ -3629,8 +5718,8 @@
 </file>
 
 <file path=word/numbering.xml><?xml version="1.0" encoding="utf-8"?>
-<w:numbering xmlns:wpc="http://schemas.microsoft.com/office/word/2010/wordprocessingCanvas" xmlns:mc="http://schemas.openxmlformats.org/markup-compatibility/2006" xmlns:o="urn:schemas-microsoft-com:office:office" xmlns:r="http://schemas.openxmlformats.org/officeDocument/2006/relationships" xmlns:m="http://schemas.openxmlformats.org/officeDocument/2006/math" xmlns:v="urn:schemas-microsoft-com:vml" xmlns:wp14="http://schemas.microsoft.com/office/word/2010/wordprocessingDrawing" xmlns:wp="http://schemas.openxmlformats.org/drawingml/2006/wordprocessingDrawing" xmlns:w10="urn:schemas-microsoft-com:office:word" xmlns:w="http://schemas.openxmlformats.org/wordprocessingml/2006/main" xmlns:w14="http://schemas.microsoft.com/office/word/2010/wordml" xmlns:w15="http://schemas.microsoft.com/office/word/2012/wordml" xmlns:wpg="http://schemas.microsoft.com/office/word/2010/wordprocessingGroup" xmlns:wpi="http://schemas.microsoft.com/office/word/2010/wordprocessingInk" xmlns:wne="http://schemas.microsoft.com/office/word/2006/wordml" xmlns:wps="http://schemas.microsoft.com/office/word/2010/wordprocessingShape" mc:Ignorable="w14 w15 wp14">
-  <w:abstractNum w:abstractNumId="0">
+<w:numbering xmlns:wpc="http://schemas.microsoft.com/office/word/2010/wordprocessingCanvas" xmlns:cx="http://schemas.microsoft.com/office/drawing/2014/chartex" xmlns:cx1="http://schemas.microsoft.com/office/drawing/2015/9/8/chartex" xmlns:cx2="http://schemas.microsoft.com/office/drawing/2015/10/21/chartex" xmlns:cx3="http://schemas.microsoft.com/office/drawing/2016/5/9/chartex" xmlns:cx4="http://schemas.microsoft.com/office/drawing/2016/5/10/chartex" xmlns:cx5="http://schemas.microsoft.com/office/drawing/2016/5/11/chartex" xmlns:cx6="http://schemas.microsoft.com/office/drawing/2016/5/12/chartex" xmlns:cx7="http://schemas.microsoft.com/office/drawing/2016/5/13/chartex" xmlns:cx8="http://schemas.microsoft.com/office/drawing/2016/5/14/chartex" xmlns:mc="http://schemas.openxmlformats.org/markup-compatibility/2006" xmlns:aink="http://schemas.microsoft.com/office/drawing/2016/ink" xmlns:am3d="http://schemas.microsoft.com/office/drawing/2017/model3d" xmlns:o="urn:schemas-microsoft-com:office:office" xmlns:oel="http://schemas.microsoft.com/office/2019/extlst" xmlns:r="http://schemas.openxmlformats.org/officeDocument/2006/relationships" xmlns:m="http://schemas.openxmlformats.org/officeDocument/2006/math" xmlns:v="urn:schemas-microsoft-com:vml" xmlns:wp14="http://schemas.microsoft.com/office/word/2010/wordprocessingDrawing" xmlns:wp="http://schemas.openxmlformats.org/drawingml/2006/wordprocessingDrawing" xmlns:w10="urn:schemas-microsoft-com:office:word" xmlns:w="http://schemas.openxmlformats.org/wordprocessingml/2006/main" xmlns:w14="http://schemas.microsoft.com/office/word/2010/wordml" xmlns:w15="http://schemas.microsoft.com/office/word/2012/wordml" xmlns:w16cex="http://schemas.microsoft.com/office/word/2018/wordml/cex" xmlns:w16cid="http://schemas.microsoft.com/office/word/2016/wordml/cid" xmlns:w16="http://schemas.microsoft.com/office/word/2018/wordml" xmlns:w16du="http://schemas.microsoft.com/office/word/2023/wordml/word16du" xmlns:w16sdtdh="http://schemas.microsoft.com/office/word/2020/wordml/sdtdatahash" xmlns:w16sdtfl="http://schemas.microsoft.com/office/word/2024/wordml/sdtformatlock" xmlns:w16se="http://schemas.microsoft.com/office/word/2015/wordml/symex" xmlns:wpg="http://schemas.microsoft.com/office/word/2010/wordprocessingGroup" xmlns:wpi="http://schemas.microsoft.com/office/word/2010/wordprocessingInk" xmlns:wne="http://schemas.microsoft.com/office/word/2006/wordml" xmlns:wps="http://schemas.microsoft.com/office/word/2010/wordprocessingShape" mc:Ignorable="w14 w15 w16se w16cid w16 w16cex w16sdtdh w16sdtfl w16du wp14">
+  <w:abstractNum w:abstractNumId="0" w15:restartNumberingAfterBreak="0">
     <w:nsid w:val="28B72FEF"/>
     <w:multiLevelType w:val="multilevel"/>
     <w:tmpl w:val="D45C53F2"/>
@@ -3763,7 +5852,7 @@
       </w:rPr>
     </w:lvl>
   </w:abstractNum>
-  <w:abstractNum w:abstractNumId="1">
+  <w:abstractNum w:abstractNumId="1" w15:restartNumberingAfterBreak="0">
     <w:nsid w:val="2A6515D4"/>
     <w:multiLevelType w:val="multilevel"/>
     <w:tmpl w:val="CADC0308"/>
@@ -3905,7 +5994,185 @@
       </w:rPr>
     </w:lvl>
   </w:abstractNum>
-  <w:abstractNum w:abstractNumId="2">
+  <w:abstractNum w:abstractNumId="2" w15:restartNumberingAfterBreak="0">
+    <w:nsid w:val="2A9A1A98"/>
+    <w:multiLevelType w:val="hybridMultilevel"/>
+    <w:tmpl w:val="CBE6B960"/>
+    <w:lvl w:ilvl="0" w:tplc="72E09AF2">
+      <w:start w:val="1"/>
+      <w:numFmt w:val="decimal"/>
+      <w:lvlText w:val="%1"/>
+      <w:lvlJc w:val="left"/>
+      <w:pPr>
+        <w:ind w:left="630" w:hanging="360"/>
+      </w:pPr>
+      <w:rPr>
+        <w:rFonts w:hint="default"/>
+      </w:rPr>
+    </w:lvl>
+    <w:lvl w:ilvl="1" w:tplc="FFFFFFFF" w:tentative="1">
+      <w:start w:val="1"/>
+      <w:numFmt w:val="lowerLetter"/>
+      <w:lvlText w:val="%2."/>
+      <w:lvlJc w:val="left"/>
+      <w:pPr>
+        <w:ind w:left="1350" w:hanging="360"/>
+      </w:pPr>
+    </w:lvl>
+    <w:lvl w:ilvl="2" w:tplc="FFFFFFFF" w:tentative="1">
+      <w:start w:val="1"/>
+      <w:numFmt w:val="lowerRoman"/>
+      <w:lvlText w:val="%3."/>
+      <w:lvlJc w:val="right"/>
+      <w:pPr>
+        <w:ind w:left="2070" w:hanging="180"/>
+      </w:pPr>
+    </w:lvl>
+    <w:lvl w:ilvl="3" w:tplc="FFFFFFFF" w:tentative="1">
+      <w:start w:val="1"/>
+      <w:numFmt w:val="decimal"/>
+      <w:lvlText w:val="%4."/>
+      <w:lvlJc w:val="left"/>
+      <w:pPr>
+        <w:ind w:left="2790" w:hanging="360"/>
+      </w:pPr>
+    </w:lvl>
+    <w:lvl w:ilvl="4" w:tplc="FFFFFFFF" w:tentative="1">
+      <w:start w:val="1"/>
+      <w:numFmt w:val="lowerLetter"/>
+      <w:lvlText w:val="%5."/>
+      <w:lvlJc w:val="left"/>
+      <w:pPr>
+        <w:ind w:left="3510" w:hanging="360"/>
+      </w:pPr>
+    </w:lvl>
+    <w:lvl w:ilvl="5" w:tplc="FFFFFFFF" w:tentative="1">
+      <w:start w:val="1"/>
+      <w:numFmt w:val="lowerRoman"/>
+      <w:lvlText w:val="%6."/>
+      <w:lvlJc w:val="right"/>
+      <w:pPr>
+        <w:ind w:left="4230" w:hanging="180"/>
+      </w:pPr>
+    </w:lvl>
+    <w:lvl w:ilvl="6" w:tplc="FFFFFFFF" w:tentative="1">
+      <w:start w:val="1"/>
+      <w:numFmt w:val="decimal"/>
+      <w:lvlText w:val="%7."/>
+      <w:lvlJc w:val="left"/>
+      <w:pPr>
+        <w:ind w:left="4950" w:hanging="360"/>
+      </w:pPr>
+    </w:lvl>
+    <w:lvl w:ilvl="7" w:tplc="FFFFFFFF" w:tentative="1">
+      <w:start w:val="1"/>
+      <w:numFmt w:val="lowerLetter"/>
+      <w:lvlText w:val="%8."/>
+      <w:lvlJc w:val="left"/>
+      <w:pPr>
+        <w:ind w:left="5670" w:hanging="360"/>
+      </w:pPr>
+    </w:lvl>
+    <w:lvl w:ilvl="8" w:tplc="FFFFFFFF" w:tentative="1">
+      <w:start w:val="1"/>
+      <w:numFmt w:val="lowerRoman"/>
+      <w:lvlText w:val="%9."/>
+      <w:lvlJc w:val="right"/>
+      <w:pPr>
+        <w:ind w:left="6390" w:hanging="180"/>
+      </w:pPr>
+    </w:lvl>
+  </w:abstractNum>
+  <w:abstractNum w:abstractNumId="3" w15:restartNumberingAfterBreak="0">
+    <w:nsid w:val="581978EB"/>
+    <w:multiLevelType w:val="hybridMultilevel"/>
+    <w:tmpl w:val="A972172A"/>
+    <w:lvl w:ilvl="0" w:tplc="72E09AF2">
+      <w:start w:val="1"/>
+      <w:numFmt w:val="decimal"/>
+      <w:lvlText w:val="%1"/>
+      <w:lvlJc w:val="left"/>
+      <w:pPr>
+        <w:ind w:left="630" w:hanging="360"/>
+      </w:pPr>
+      <w:rPr>
+        <w:rFonts w:hint="default"/>
+      </w:rPr>
+    </w:lvl>
+    <w:lvl w:ilvl="1" w:tplc="04090019" w:tentative="1">
+      <w:start w:val="1"/>
+      <w:numFmt w:val="lowerLetter"/>
+      <w:lvlText w:val="%2."/>
+      <w:lvlJc w:val="left"/>
+      <w:pPr>
+        <w:ind w:left="1350" w:hanging="360"/>
+      </w:pPr>
+    </w:lvl>
+    <w:lvl w:ilvl="2" w:tplc="0409001B" w:tentative="1">
+      <w:start w:val="1"/>
+      <w:numFmt w:val="lowerRoman"/>
+      <w:lvlText w:val="%3."/>
+      <w:lvlJc w:val="right"/>
+      <w:pPr>
+        <w:ind w:left="2070" w:hanging="180"/>
+      </w:pPr>
+    </w:lvl>
+    <w:lvl w:ilvl="3" w:tplc="0409000F" w:tentative="1">
+      <w:start w:val="1"/>
+      <w:numFmt w:val="decimal"/>
+      <w:lvlText w:val="%4."/>
+      <w:lvlJc w:val="left"/>
+      <w:pPr>
+        <w:ind w:left="2790" w:hanging="360"/>
+      </w:pPr>
+    </w:lvl>
+    <w:lvl w:ilvl="4" w:tplc="04090019" w:tentative="1">
+      <w:start w:val="1"/>
+      <w:numFmt w:val="lowerLetter"/>
+      <w:lvlText w:val="%5."/>
+      <w:lvlJc w:val="left"/>
+      <w:pPr>
+        <w:ind w:left="3510" w:hanging="360"/>
+      </w:pPr>
+    </w:lvl>
+    <w:lvl w:ilvl="5" w:tplc="0409001B" w:tentative="1">
+      <w:start w:val="1"/>
+      <w:numFmt w:val="lowerRoman"/>
+      <w:lvlText w:val="%6."/>
+      <w:lvlJc w:val="right"/>
+      <w:pPr>
+        <w:ind w:left="4230" w:hanging="180"/>
+      </w:pPr>
+    </w:lvl>
+    <w:lvl w:ilvl="6" w:tplc="0409000F" w:tentative="1">
+      <w:start w:val="1"/>
+      <w:numFmt w:val="decimal"/>
+      <w:lvlText w:val="%7."/>
+      <w:lvlJc w:val="left"/>
+      <w:pPr>
+        <w:ind w:left="4950" w:hanging="360"/>
+      </w:pPr>
+    </w:lvl>
+    <w:lvl w:ilvl="7" w:tplc="04090019" w:tentative="1">
+      <w:start w:val="1"/>
+      <w:numFmt w:val="lowerLetter"/>
+      <w:lvlText w:val="%8."/>
+      <w:lvlJc w:val="left"/>
+      <w:pPr>
+        <w:ind w:left="5670" w:hanging="360"/>
+      </w:pPr>
+    </w:lvl>
+    <w:lvl w:ilvl="8" w:tplc="0409001B" w:tentative="1">
+      <w:start w:val="1"/>
+      <w:numFmt w:val="lowerRoman"/>
+      <w:lvlText w:val="%9."/>
+      <w:lvlJc w:val="right"/>
+      <w:pPr>
+        <w:ind w:left="6390" w:hanging="180"/>
+      </w:pPr>
+    </w:lvl>
+  </w:abstractNum>
+  <w:abstractNum w:abstractNumId="4" w15:restartNumberingAfterBreak="0">
     <w:nsid w:val="67910029"/>
     <w:multiLevelType w:val="multilevel"/>
     <w:tmpl w:val="D39C8ED8"/>
@@ -4038,20 +6305,26 @@
       </w:rPr>
     </w:lvl>
   </w:abstractNum>
-  <w:num w:numId="1">
+  <w:num w:numId="1" w16cid:durableId="1747266641">
     <w:abstractNumId w:val="0"/>
   </w:num>
-  <w:num w:numId="2">
+  <w:num w:numId="2" w16cid:durableId="1772387228">
+    <w:abstractNumId w:val="4"/>
+  </w:num>
+  <w:num w:numId="3" w16cid:durableId="1252474530">
+    <w:abstractNumId w:val="1"/>
+  </w:num>
+  <w:num w:numId="4" w16cid:durableId="1929000181">
+    <w:abstractNumId w:val="3"/>
+  </w:num>
+  <w:num w:numId="5" w16cid:durableId="1864055140">
     <w:abstractNumId w:val="2"/>
-  </w:num>
-  <w:num w:numId="3">
-    <w:abstractNumId w:val="1"/>
   </w:num>
 </w:numbering>
 </file>
 
 <file path=word/styles.xml><?xml version="1.0" encoding="utf-8"?>
-<w:styles xmlns:mc="http://schemas.openxmlformats.org/markup-compatibility/2006" xmlns:r="http://schemas.openxmlformats.org/officeDocument/2006/relationships" xmlns:w="http://schemas.openxmlformats.org/wordprocessingml/2006/main" xmlns:w14="http://schemas.microsoft.com/office/word/2010/wordml" xmlns:w15="http://schemas.microsoft.com/office/word/2012/wordml" mc:Ignorable="w14 w15">
+<w:styles xmlns:mc="http://schemas.openxmlformats.org/markup-compatibility/2006" xmlns:r="http://schemas.openxmlformats.org/officeDocument/2006/relationships" xmlns:w="http://schemas.openxmlformats.org/wordprocessingml/2006/main" xmlns:w14="http://schemas.microsoft.com/office/word/2010/wordml" xmlns:w15="http://schemas.microsoft.com/office/word/2012/wordml" xmlns:w16cex="http://schemas.microsoft.com/office/word/2018/wordml/cex" xmlns:w16cid="http://schemas.microsoft.com/office/word/2016/wordml/cid" xmlns:w16="http://schemas.microsoft.com/office/word/2018/wordml" xmlns:w16du="http://schemas.microsoft.com/office/word/2023/wordml/word16du" xmlns:w16sdtdh="http://schemas.microsoft.com/office/word/2020/wordml/sdtdatahash" xmlns:w16sdtfl="http://schemas.microsoft.com/office/word/2024/wordml/sdtformatlock" xmlns:w16se="http://schemas.microsoft.com/office/word/2015/wordml/symex" mc:Ignorable="w14 w15 w16se w16cid w16 w16cex w16sdtdh w16sdtfl w16du">
   <w:docDefaults>
     <w:rPrDefault>
       <w:rPr>
@@ -4067,7 +6340,7 @@
       </w:pPr>
     </w:pPrDefault>
   </w:docDefaults>
-  <w:latentStyles w:defLockedState="0" w:defUIPriority="99" w:defSemiHidden="0" w:defUnhideWhenUsed="0" w:defQFormat="0" w:count="371">
+  <w:latentStyles w:defLockedState="0" w:defUIPriority="99" w:defSemiHidden="0" w:defUnhideWhenUsed="0" w:defQFormat="0" w:count="376">
     <w:lsdException w:name="Normal" w:uiPriority="0" w:qFormat="1"/>
     <w:lsdException w:name="heading 1" w:uiPriority="9" w:qFormat="1"/>
     <w:lsdException w:name="heading 2" w:semiHidden="1" w:uiPriority="9" w:unhideWhenUsed="1" w:qFormat="1"/>
@@ -4439,6 +6712,11 @@
     <w:lsdException w:name="List Table 5 Dark Accent 6" w:uiPriority="50"/>
     <w:lsdException w:name="List Table 6 Colorful Accent 6" w:uiPriority="51"/>
     <w:lsdException w:name="List Table 7 Colorful Accent 6" w:uiPriority="52"/>
+    <w:lsdException w:name="Mention" w:semiHidden="1" w:unhideWhenUsed="1"/>
+    <w:lsdException w:name="Smart Hyperlink" w:semiHidden="1" w:unhideWhenUsed="1"/>
+    <w:lsdException w:name="Hashtag" w:semiHidden="1" w:unhideWhenUsed="1"/>
+    <w:lsdException w:name="Unresolved Mention" w:semiHidden="1" w:unhideWhenUsed="1"/>
+    <w:lsdException w:name="Smart Link" w:semiHidden="1" w:unhideWhenUsed="1"/>
   </w:latentStyles>
   <w:style w:type="paragraph" w:default="1" w:styleId="Normal">
     <w:name w:val="Normal"/>
@@ -4684,7 +6962,6 @@
   <w:style w:type="character" w:default="1" w:styleId="DefaultParagraphFont">
     <w:name w:val="Default Paragraph Font"/>
     <w:uiPriority w:val="1"/>
-    <w:semiHidden/>
     <w:unhideWhenUsed/>
   </w:style>
   <w:style w:type="table" w:default="1" w:styleId="TableNormal">
@@ -4920,7 +7197,6 @@
       <w:spacing w:after="0" w:line="240" w:lineRule="auto"/>
     </w:pPr>
     <w:tblPr>
-      <w:tblInd w:w="0" w:type="dxa"/>
       <w:tblBorders>
         <w:top w:val="single" w:sz="4" w:space="0" w:color="auto"/>
         <w:left w:val="single" w:sz="4" w:space="0" w:color="auto"/>
@@ -4929,12 +7205,6 @@
         <w:insideH w:val="single" w:sz="4" w:space="0" w:color="auto"/>
         <w:insideV w:val="single" w:sz="4" w:space="0" w:color="auto"/>
       </w:tblBorders>
-      <w:tblCellMar>
-        <w:top w:w="0" w:type="dxa"/>
-        <w:left w:w="108" w:type="dxa"/>
-        <w:bottom w:w="0" w:type="dxa"/>
-        <w:right w:w="108" w:type="dxa"/>
-      </w:tblCellMar>
     </w:tblPr>
   </w:style>
   <w:style w:type="table" w:customStyle="1" w:styleId="Style1">
@@ -4949,7 +7219,6 @@
       <w:sz w:val="26"/>
     </w:rPr>
     <w:tblPr>
-      <w:tblInd w:w="0" w:type="dxa"/>
       <w:tblBorders>
         <w:top w:val="single" w:sz="4" w:space="0" w:color="auto"/>
         <w:left w:val="single" w:sz="4" w:space="0" w:color="auto"/>
@@ -4958,12 +7227,6 @@
         <w:insideH w:val="single" w:sz="4" w:space="0" w:color="auto"/>
         <w:insideV w:val="single" w:sz="4" w:space="0" w:color="auto"/>
       </w:tblBorders>
-      <w:tblCellMar>
-        <w:top w:w="0" w:type="dxa"/>
-        <w:left w:w="108" w:type="dxa"/>
-        <w:bottom w:w="0" w:type="dxa"/>
-        <w:right w:w="108" w:type="dxa"/>
-      </w:tblCellMar>
     </w:tblPr>
     <w:tcPr>
       <w:tcMar>
@@ -5047,6 +7310,17 @@
       <w:sz w:val="24"/>
       <w:szCs w:val="24"/>
     </w:rPr>
+  </w:style>
+  <w:style w:type="paragraph" w:styleId="ListParagraph">
+    <w:name w:val="List Paragraph"/>
+    <w:basedOn w:val="Normal"/>
+    <w:uiPriority w:val="34"/>
+    <w:qFormat/>
+    <w:rsid w:val="00F6127D"/>
+    <w:pPr>
+      <w:ind w:left="720"/>
+      <w:contextualSpacing/>
+    </w:pPr>
   </w:style>
 </w:styles>
 </file>

</xml_diff>